<commit_message>
:page_facing_up: update nimsai tcc doc
</commit_message>
<xml_diff>
--- a/documentos - tcc/TCCI_nimsai.docx
+++ b/documentos - tcc/TCCI_nimsai.docx
@@ -4463,6 +4463,62 @@
         <w:t xml:space="preserve">.</w:t>
       </w:r>
     </w:p>
+    <w:sdt>
+      <w:sdtPr>
+        <w:tag w:val="goog_rdk_33"/>
+      </w:sdtPr>
+      <w:sdtContent>
+        <w:p>
+          <w:pPr>
+            <w:spacing w:after="240" w:before="240" w:lineRule="auto"/>
+            <w:jc w:val="both"/>
+            <w:rPr>
+              <w:ins w:author="Iasmin Marques" w:id="1" w:date="2025-03-08T13:34:11Z"/>
+              <w:rFonts w:ascii="Arial" w:cs="Arial" w:eastAsia="Arial" w:hAnsi="Arial"/>
+              <w:b w:val="1"/>
+              <w:sz w:val="24"/>
+              <w:szCs w:val="24"/>
+              <w:highlight w:val="white"/>
+            </w:rPr>
+          </w:pPr>
+          <w:r>
+            <w:rPr>
+              <w:rFonts w:ascii="Arial" w:cs="Arial" w:eastAsia="Arial" w:hAnsi="Arial"/>
+              <w:b w:val="1"/>
+              <w:sz w:val="24"/>
+              <w:szCs w:val="24"/>
+              <w:rtl w:val="0"/>
+            </w:rPr>
+            <w:t xml:space="preserve">3.2  </w:t>
+          </w:r>
+          <w:r>
+            <w:rPr>
+              <w:rFonts w:ascii="Arial" w:cs="Arial" w:eastAsia="Arial" w:hAnsi="Arial"/>
+              <w:b w:val="1"/>
+              <w:sz w:val="24"/>
+              <w:szCs w:val="24"/>
+              <w:highlight w:val="white"/>
+              <w:rtl w:val="0"/>
+            </w:rPr>
+            <w:t xml:space="preserve">DADOS</w:t>
+          </w:r>
+          <w:sdt>
+            <w:sdtPr>
+              <w:tag w:val="goog_rdk_32"/>
+            </w:sdtPr>
+            <w:sdtContent>
+              <w:ins w:author="Iasmin Marques" w:id="1" w:date="2025-03-08T13:34:11Z">
+                <w:r>
+                  <w:rPr>
+                    <w:rtl w:val="0"/>
+                  </w:rPr>
+                </w:r>
+              </w:ins>
+            </w:sdtContent>
+          </w:sdt>
+        </w:p>
+      </w:sdtContent>
+    </w:sdt>
     <w:p>
       <w:pPr>
         <w:spacing w:after="240" w:before="240" w:lineRule="auto"/>
@@ -4475,50 +4531,30 @@
           <w:highlight w:val="white"/>
         </w:rPr>
       </w:pPr>
-      <w:r>
-        <w:rPr>
-          <w:rFonts w:ascii="Arial" w:cs="Arial" w:eastAsia="Arial" w:hAnsi="Arial"/>
-          <w:b w:val="1"/>
-          <w:sz w:val="24"/>
-          <w:szCs w:val="24"/>
-          <w:rtl w:val="0"/>
-        </w:rPr>
-        <w:t xml:space="preserve">3.2  </w:t>
-      </w:r>
-      <w:r>
-        <w:rPr>
-          <w:rFonts w:ascii="Arial" w:cs="Arial" w:eastAsia="Arial" w:hAnsi="Arial"/>
-          <w:b w:val="1"/>
-          <w:sz w:val="24"/>
-          <w:szCs w:val="24"/>
-          <w:highlight w:val="white"/>
-          <w:rtl w:val="0"/>
-        </w:rPr>
-        <w:t xml:space="preserve">DADOS</w:t>
-      </w:r>
-    </w:p>
-    <w:p>
-      <w:pPr>
-        <w:spacing w:after="240" w:before="240" w:lineRule="auto"/>
-        <w:jc w:val="both"/>
-        <w:rPr>
-          <w:rFonts w:ascii="Arial" w:cs="Arial" w:eastAsia="Arial" w:hAnsi="Arial"/>
-          <w:b w:val="1"/>
-          <w:sz w:val="24"/>
-          <w:szCs w:val="24"/>
-          <w:highlight w:val="white"/>
-        </w:rPr>
-      </w:pPr>
-      <w:r>
-        <w:rPr>
-          <w:rFonts w:ascii="Arial" w:cs="Arial" w:eastAsia="Arial" w:hAnsi="Arial"/>
-          <w:b w:val="1"/>
-          <w:sz w:val="24"/>
-          <w:szCs w:val="24"/>
-          <w:highlight w:val="white"/>
-          <w:rtl w:val="0"/>
-        </w:rPr>
-        <w:t xml:space="preserve">[comentar sobre dados ?]</w:t>
+      <w:sdt>
+        <w:sdtPr>
+          <w:tag w:val="goog_rdk_34"/>
+        </w:sdtPr>
+        <w:sdtContent>
+          <w:ins w:author="Iasmin Marques" w:id="1" w:date="2025-03-08T13:34:11Z">
+            <w:r>
+              <w:rPr>
+                <w:rFonts w:ascii="Arial" w:cs="Arial" w:eastAsia="Arial" w:hAnsi="Arial"/>
+                <w:b w:val="1"/>
+                <w:sz w:val="24"/>
+                <w:szCs w:val="24"/>
+                <w:highlight w:val="white"/>
+                <w:rtl w:val="0"/>
+              </w:rPr>
+              <w:t xml:space="preserve">[comentar sobre dados ?]</w:t>
+            </w:r>
+          </w:ins>
+        </w:sdtContent>
+      </w:sdt>
+      <w:r>
+        <w:rPr>
+          <w:rtl w:val="0"/>
+        </w:rPr>
       </w:r>
     </w:p>
     <w:p>
@@ -4623,7 +4659,7 @@
       </w:r>
       <w:sdt>
         <w:sdtPr>
-          <w:tag w:val="goog_rdk_32"/>
+          <w:tag w:val="goog_rdk_35"/>
         </w:sdtPr>
         <w:sdtContent>
           <w:commentRangeStart w:id="27"/>
@@ -4631,7 +4667,7 @@
       </w:sdt>
       <w:sdt>
         <w:sdtPr>
-          <w:tag w:val="goog_rdk_33"/>
+          <w:tag w:val="goog_rdk_36"/>
         </w:sdtPr>
         <w:sdtContent>
           <w:commentRangeStart w:id="28"/>
@@ -4699,7 +4735,7 @@
       </w:r>
       <w:sdt>
         <w:sdtPr>
-          <w:tag w:val="goog_rdk_34"/>
+          <w:tag w:val="goog_rdk_37"/>
         </w:sdtPr>
         <w:sdtContent>
           <w:commentRangeStart w:id="29"/>
@@ -4772,7 +4808,7 @@
       </w:r>
       <w:sdt>
         <w:sdtPr>
-          <w:tag w:val="goog_rdk_35"/>
+          <w:tag w:val="goog_rdk_38"/>
         </w:sdtPr>
         <w:sdtContent>
           <w:commentRangeStart w:id="30"/>
@@ -4818,7 +4854,7 @@
       </w:r>
       <w:sdt>
         <w:sdtPr>
-          <w:tag w:val="goog_rdk_36"/>
+          <w:tag w:val="goog_rdk_39"/>
         </w:sdtPr>
         <w:sdtContent>
           <w:commentRangeStart w:id="31"/>
@@ -4849,7 +4885,7 @@
       </w:r>
       <w:sdt>
         <w:sdtPr>
-          <w:tag w:val="goog_rdk_37"/>
+          <w:tag w:val="goog_rdk_40"/>
         </w:sdtPr>
         <w:sdtContent>
           <w:commentRangeStart w:id="32"/>
@@ -4889,7 +4925,7 @@
       </w:r>
       <w:sdt>
         <w:sdtPr>
-          <w:tag w:val="goog_rdk_38"/>
+          <w:tag w:val="goog_rdk_41"/>
         </w:sdtPr>
         <w:sdtContent>
           <w:commentRangeStart w:id="33"/>
@@ -5011,7 +5047,7 @@
       </w:r>
       <w:sdt>
         <w:sdtPr>
-          <w:tag w:val="goog_rdk_39"/>
+          <w:tag w:val="goog_rdk_42"/>
         </w:sdtPr>
         <w:sdtContent>
           <w:commentRangeStart w:id="34"/>
@@ -5019,7 +5055,7 @@
       </w:sdt>
       <w:sdt>
         <w:sdtPr>
-          <w:tag w:val="goog_rdk_40"/>
+          <w:tag w:val="goog_rdk_43"/>
         </w:sdtPr>
         <w:sdtContent>
           <w:commentRangeStart w:id="35"/>
@@ -5073,7 +5109,7 @@
       </w:r>
       <w:sdt>
         <w:sdtPr>
-          <w:tag w:val="goog_rdk_41"/>
+          <w:tag w:val="goog_rdk_44"/>
         </w:sdtPr>
         <w:sdtContent>
           <w:commentRangeStart w:id="36"/>
@@ -5194,7 +5230,7 @@
       </w:r>
       <w:sdt>
         <w:sdtPr>
-          <w:tag w:val="goog_rdk_42"/>
+          <w:tag w:val="goog_rdk_45"/>
         </w:sdtPr>
         <w:sdtContent>
           <w:commentRangeStart w:id="37"/>
@@ -5234,19 +5270,19 @@
       </w:pPr>
       <w:sdt>
         <w:sdtPr>
-          <w:tag w:val="goog_rdk_44"/>
+          <w:tag w:val="goog_rdk_47"/>
         </w:sdtPr>
         <w:sdtContent>
-          <w:del w:author="Iasmin Marques" w:id="1" w:date="2025-03-07T18:43:07Z"/>
+          <w:del w:author="Iasmin Marques" w:id="2" w:date="2025-03-07T18:43:07Z"/>
           <w:sdt>
             <w:sdtPr>
-              <w:tag w:val="goog_rdk_45"/>
+              <w:tag w:val="goog_rdk_48"/>
             </w:sdtPr>
             <w:sdtContent>
               <w:commentRangeStart w:id="38"/>
             </w:sdtContent>
           </w:sdt>
-          <w:del w:author="Iasmin Marques" w:id="1" w:date="2025-03-07T18:43:07Z">
+          <w:del w:author="Iasmin Marques" w:id="2" w:date="2025-03-07T18:43:07Z">
             <w:r>
               <w:rPr>
                 <w:rFonts w:ascii="Arial" w:cs="Arial" w:eastAsia="Arial" w:hAnsi="Arial"/>
@@ -5298,7 +5334,7 @@
       </w:pPr>
       <w:sdt>
         <w:sdtPr>
-          <w:tag w:val="goog_rdk_46"/>
+          <w:tag w:val="goog_rdk_49"/>
         </w:sdtPr>
         <w:sdtContent>
           <w:commentRangeStart w:id="39"/>
@@ -5306,7 +5342,7 @@
       </w:sdt>
       <w:sdt>
         <w:sdtPr>
-          <w:tag w:val="goog_rdk_47"/>
+          <w:tag w:val="goog_rdk_50"/>
         </w:sdtPr>
         <w:sdtContent>
           <w:commentRangeStart w:id="40"/>
@@ -5394,7 +5430,7 @@
       </w:r>
       <w:sdt>
         <w:sdtPr>
-          <w:tag w:val="goog_rdk_48"/>
+          <w:tag w:val="goog_rdk_51"/>
         </w:sdtPr>
         <w:sdtContent>
           <w:commentRangeStart w:id="41"/>
@@ -5433,31 +5469,45 @@
           <w:szCs w:val="24"/>
         </w:rPr>
       </w:pPr>
-      <w:r>
-        <w:rPr>
-          <w:rFonts w:ascii="Arial" w:cs="Arial" w:eastAsia="Arial" w:hAnsi="Arial"/>
-          <w:sz w:val="24"/>
-          <w:szCs w:val="24"/>
-          <w:rtl w:val="0"/>
-        </w:rPr>
-        <w:t xml:space="preserve">Na etapa de pré-processamento é onde ocorre o tratamento de valores ausentes, normalização de variáveis e balanceamento de classes. </w:t>
-      </w:r>
-    </w:p>
-    <w:p>
-      <w:pPr>
-        <w:ind w:left="0" w:firstLine="720"/>
-        <w:rPr>
-          <w:rFonts w:ascii="Arial" w:cs="Arial" w:eastAsia="Arial" w:hAnsi="Arial"/>
-          <w:sz w:val="24"/>
-          <w:szCs w:val="24"/>
-        </w:rPr>
-      </w:pPr>
       <w:sdt>
         <w:sdtPr>
-          <w:tag w:val="goog_rdk_50"/>
+          <w:tag w:val="goog_rdk_53"/>
         </w:sdtPr>
         <w:sdtContent>
-          <w:del w:author="Iasmin Marques" w:id="2" w:date="2025-03-07T19:14:41Z">
+          <w:del w:author="Iasmin Marques" w:id="3" w:date="2025-03-08T13:35:25Z">
+            <w:r>
+              <w:rPr>
+                <w:rFonts w:ascii="Arial" w:cs="Arial" w:eastAsia="Arial" w:hAnsi="Arial"/>
+                <w:sz w:val="24"/>
+                <w:szCs w:val="24"/>
+                <w:rtl w:val="0"/>
+              </w:rPr>
+              <w:delText xml:space="preserve">Na etapa de pré-processamento é onde ocorre o tratamento de valores ausentes, normalização de variáveis e balanceamento de classes. </w:delText>
+            </w:r>
+          </w:del>
+        </w:sdtContent>
+      </w:sdt>
+      <w:r>
+        <w:rPr>
+          <w:rtl w:val="0"/>
+        </w:rPr>
+      </w:r>
+    </w:p>
+    <w:p>
+      <w:pPr>
+        <w:ind w:left="0" w:firstLine="720"/>
+        <w:rPr>
+          <w:rFonts w:ascii="Arial" w:cs="Arial" w:eastAsia="Arial" w:hAnsi="Arial"/>
+          <w:sz w:val="24"/>
+          <w:szCs w:val="24"/>
+        </w:rPr>
+      </w:pPr>
+      <w:sdt>
+        <w:sdtPr>
+          <w:tag w:val="goog_rdk_55"/>
+        </w:sdtPr>
+        <w:sdtContent>
+          <w:del w:author="Iasmin Marques" w:id="4" w:date="2025-03-07T19:14:41Z">
             <w:r>
               <w:rPr>
                 <w:rFonts w:ascii="Arial" w:cs="Arial" w:eastAsia="Arial" w:hAnsi="Arial"/>
@@ -5497,7 +5547,7 @@
       </w:r>
       <w:sdt>
         <w:sdtPr>
-          <w:tag w:val="goog_rdk_51"/>
+          <w:tag w:val="goog_rdk_56"/>
         </w:sdtPr>
         <w:sdtContent>
           <w:commentRangeStart w:id="42"/>
@@ -5533,10 +5583,10 @@
       </w:pPr>
       <w:sdt>
         <w:sdtPr>
-          <w:tag w:val="goog_rdk_53"/>
+          <w:tag w:val="goog_rdk_58"/>
         </w:sdtPr>
         <w:sdtContent>
-          <w:del w:author="Iasmin Marques" w:id="3" w:date="2025-03-07T19:14:44Z">
+          <w:del w:author="Iasmin Marques" w:id="5" w:date="2025-03-07T19:14:44Z">
             <w:r>
               <w:rPr>
                 <w:rFonts w:ascii="Arial" w:cs="Arial" w:eastAsia="Arial" w:hAnsi="Arial"/>
@@ -5576,7 +5626,7 @@
       </w:r>
       <w:sdt>
         <w:sdtPr>
-          <w:tag w:val="goog_rdk_54"/>
+          <w:tag w:val="goog_rdk_59"/>
         </w:sdtPr>
         <w:sdtContent>
           <w:commentRangeStart w:id="43"/>
@@ -5615,25 +5665,9 @@
           <w:szCs w:val="24"/>
         </w:rPr>
       </w:pPr>
-      <w:r>
-        <w:rPr>
-          <w:rtl w:val="0"/>
-        </w:rPr>
-      </w:r>
-    </w:p>
-    <w:p>
-      <w:pPr>
-        <w:spacing w:after="240" w:before="240" w:lineRule="auto"/>
-        <w:jc w:val="both"/>
-        <w:rPr>
-          <w:rFonts w:ascii="Arial" w:cs="Arial" w:eastAsia="Arial" w:hAnsi="Arial"/>
-          <w:sz w:val="24"/>
-          <w:szCs w:val="24"/>
-        </w:rPr>
-      </w:pPr>
       <w:sdt>
         <w:sdtPr>
-          <w:tag w:val="goog_rdk_55"/>
+          <w:tag w:val="goog_rdk_60"/>
         </w:sdtPr>
         <w:sdtContent>
           <w:commentRangeStart w:id="44"/>
@@ -5703,10 +5737,10 @@
       </w:pPr>
       <w:sdt>
         <w:sdtPr>
-          <w:tag w:val="goog_rdk_57"/>
+          <w:tag w:val="goog_rdk_62"/>
         </w:sdtPr>
         <w:sdtContent>
-          <w:del w:author="Iasmin Marques" w:id="4" w:date="2025-03-07T19:14:48Z">
+          <w:del w:author="Iasmin Marques" w:id="6" w:date="2025-03-07T19:14:48Z">
             <w:r>
               <w:rPr>
                 <w:rFonts w:ascii="Arial" w:cs="Arial" w:eastAsia="Arial" w:hAnsi="Arial"/>
@@ -5719,13 +5753,13 @@
           </w:del>
           <w:sdt>
             <w:sdtPr>
-              <w:tag w:val="goog_rdk_58"/>
+              <w:tag w:val="goog_rdk_63"/>
             </w:sdtPr>
             <w:sdtContent>
               <w:commentRangeStart w:id="45"/>
             </w:sdtContent>
           </w:sdt>
-          <w:del w:author="Iasmin Marques" w:id="4" w:date="2025-03-07T19:14:48Z">
+          <w:del w:author="Iasmin Marques" w:id="6" w:date="2025-03-07T19:14:48Z">
             <w:r>
               <w:rPr>
                 <w:rFonts w:ascii="Arial" w:cs="Arial" w:eastAsia="Arial" w:hAnsi="Arial"/>
@@ -5760,7 +5794,7 @@
       </w:pPr>
       <w:sdt>
         <w:sdtPr>
-          <w:tag w:val="goog_rdk_59"/>
+          <w:tag w:val="goog_rdk_64"/>
         </w:sdtPr>
         <w:sdtContent>
           <w:commentRangeStart w:id="46"/>
@@ -5815,7 +5849,7 @@
       </w:r>
       <w:sdt>
         <w:sdtPr>
-          <w:tag w:val="goog_rdk_60"/>
+          <w:tag w:val="goog_rdk_65"/>
         </w:sdtPr>
         <w:sdtContent>
           <w:commentRangeStart w:id="47"/>
@@ -5878,10 +5912,10 @@
       </w:r>
       <w:sdt>
         <w:sdtPr>
-          <w:tag w:val="goog_rdk_61"/>
+          <w:tag w:val="goog_rdk_66"/>
         </w:sdtPr>
         <w:sdtContent>
-          <w:del w:author="Iasmin Marques" w:id="5" w:date="2025-03-07T18:47:08Z">
+          <w:del w:author="Iasmin Marques" w:id="7" w:date="2025-03-07T18:47:08Z">
             <w:r>
               <w:rPr>
                 <w:rFonts w:ascii="Arial" w:cs="Arial" w:eastAsia="Arial" w:hAnsi="Arial"/>
@@ -5906,22 +5940,45 @@
         <w:jc w:val="both"/>
         <w:rPr>
           <w:rFonts w:ascii="Arial" w:cs="Arial" w:eastAsia="Arial" w:hAnsi="Arial"/>
-          <w:sz w:val="24"/>
-          <w:szCs w:val="24"/>
-        </w:rPr>
-      </w:pPr>
-      <w:r>
-        <w:rPr>
-          <w:rFonts w:ascii="Arial" w:cs="Arial" w:eastAsia="Arial" w:hAnsi="Arial"/>
-          <w:sz w:val="24"/>
-          <w:szCs w:val="24"/>
-          <w:rtl w:val="0"/>
-        </w:rPr>
-        <w:t xml:space="preserve">A análise de dados na saúde tem se tornado um campo fundamental para o monitoramento e tomada de decisões clínicas e epidemiológicas. O uso de dados estruturados permite a criação de modelos, como por exemplo modelos preditivos capazes de identificar padrões em grandes volumes de informações, auxiliando na prevenção e controle de doenças </w:t>
+          <w:b w:val="1"/>
+          <w:sz w:val="24"/>
+          <w:szCs w:val="24"/>
+        </w:rPr>
+      </w:pPr>
+      <w:r>
+        <w:rPr>
+          <w:rFonts w:ascii="Arial" w:cs="Arial" w:eastAsia="Arial" w:hAnsi="Arial"/>
+          <w:b w:val="1"/>
+          <w:sz w:val="24"/>
+          <w:szCs w:val="24"/>
+          <w:rtl w:val="0"/>
+        </w:rPr>
+        <w:t xml:space="preserve">[análise de dados]</w:t>
+      </w:r>
+    </w:p>
+    <w:p>
+      <w:pPr>
+        <w:spacing w:after="240" w:before="240" w:lineRule="auto"/>
+        <w:jc w:val="both"/>
+        <w:rPr>
+          <w:rFonts w:ascii="Arial" w:cs="Arial" w:eastAsia="Arial" w:hAnsi="Arial"/>
+          <w:b w:val="1"/>
+          <w:sz w:val="24"/>
+          <w:szCs w:val="24"/>
+        </w:rPr>
+      </w:pPr>
+      <w:r>
+        <w:rPr>
+          <w:rFonts w:ascii="Arial" w:cs="Arial" w:eastAsia="Arial" w:hAnsi="Arial"/>
+          <w:sz w:val="24"/>
+          <w:szCs w:val="24"/>
+          <w:rtl w:val="0"/>
+        </w:rPr>
+        <w:t xml:space="preserve">A análise de dados é um processo que possui como principal objetivo transformar informações e números em insights que auxiliam na otimização e descoberta de conhecimento para tomada de decisões mais assertivas. Métodos como o aprendizado de máquina e </w:t>
       </w:r>
       <w:sdt>
         <w:sdtPr>
-          <w:tag w:val="goog_rdk_62"/>
+          <w:tag w:val="goog_rdk_67"/>
         </w:sdtPr>
         <w:sdtContent>
           <w:commentRangeStart w:id="48"/>
@@ -5930,15 +5987,161 @@
       <w:r>
         <w:rPr>
           <w:rFonts w:ascii="Arial" w:cs="Arial" w:eastAsia="Arial" w:hAnsi="Arial"/>
+          <w:b w:val="1"/>
+          <w:sz w:val="24"/>
+          <w:szCs w:val="24"/>
+          <w:rtl w:val="0"/>
+        </w:rPr>
+        <w:t xml:space="preserve">mineração de dados</w:t>
+      </w:r>
+      <w:commentRangeEnd w:id="48"/>
+      <w:r>
+        <w:commentReference w:id="48"/>
+      </w:r>
+      <w:r>
+        <w:rPr>
+          <w:rFonts w:ascii="Arial" w:cs="Arial" w:eastAsia="Arial" w:hAnsi="Arial"/>
+          <w:sz w:val="24"/>
+          <w:szCs w:val="24"/>
+          <w:rtl w:val="0"/>
+        </w:rPr>
+        <w:t xml:space="preserve"> são amplamente utilizados para identificar padrões ocultos e gerar </w:t>
+      </w:r>
+      <w:r>
+        <w:rPr>
+          <w:rFonts w:ascii="Arial" w:cs="Arial" w:eastAsia="Arial" w:hAnsi="Arial"/>
+          <w:i w:val="1"/>
+          <w:sz w:val="24"/>
+          <w:szCs w:val="24"/>
+          <w:rtl w:val="0"/>
+        </w:rPr>
+        <w:t xml:space="preserve">insights</w:t>
+      </w:r>
+      <w:r>
+        <w:rPr>
+          <w:rFonts w:ascii="Arial" w:cs="Arial" w:eastAsia="Arial" w:hAnsi="Arial"/>
+          <w:sz w:val="24"/>
+          <w:szCs w:val="24"/>
+          <w:rtl w:val="0"/>
+        </w:rPr>
+        <w:t xml:space="preserve"> estratégicos a partir de grandes volumes de informação. </w:t>
+      </w:r>
+      <w:r>
+        <w:rPr>
+          <w:rtl w:val="0"/>
+        </w:rPr>
+      </w:r>
+    </w:p>
+    <w:p>
+      <w:pPr>
+        <w:spacing w:after="240" w:before="240" w:lineRule="auto"/>
+        <w:jc w:val="both"/>
+        <w:rPr>
+          <w:rFonts w:ascii="Arial" w:cs="Arial" w:eastAsia="Arial" w:hAnsi="Arial"/>
+          <w:b w:val="1"/>
+          <w:sz w:val="24"/>
+          <w:szCs w:val="24"/>
+        </w:rPr>
+      </w:pPr>
+      <w:sdt>
+        <w:sdtPr>
+          <w:tag w:val="goog_rdk_69"/>
+        </w:sdtPr>
+        <w:sdtContent>
+          <w:del w:author="Iasmin Marques" w:id="8" w:date="2025-03-08T13:33:47Z"/>
+          <w:sdt>
+            <w:sdtPr>
+              <w:tag w:val="goog_rdk_70"/>
+            </w:sdtPr>
+            <w:sdtContent>
+              <w:commentRangeStart w:id="49"/>
+            </w:sdtContent>
+          </w:sdt>
+          <w:del w:author="Iasmin Marques" w:id="8" w:date="2025-03-08T13:33:47Z">
+            <w:r>
+              <w:rPr>
+                <w:rFonts w:ascii="Arial" w:cs="Arial" w:eastAsia="Arial" w:hAnsi="Arial"/>
+                <w:b w:val="1"/>
+                <w:sz w:val="24"/>
+                <w:szCs w:val="24"/>
+                <w:rtl w:val="0"/>
+              </w:rPr>
+              <w:delText xml:space="preserve">Como dito anteriormente para análise de dados será aplicado o processo de descoberta de conhecimento em bases de dados (KDD) pode ser subdividido em etapas que incluem a seleção, limpeza, transformação e modelagem dos dados, permitindo que organizações e pesquisadores extraiam informações relevantes para seus respectivos </w:delText>
+            </w:r>
+            <w:sdt>
+              <w:sdtPr>
+                <w:tag w:val="goog_rdk_71"/>
+              </w:sdtPr>
+              <w:sdtContent>
+                <w:commentRangeStart w:id="50"/>
+              </w:sdtContent>
+            </w:sdt>
+            <w:r>
+              <w:rPr>
+                <w:rFonts w:ascii="Arial" w:cs="Arial" w:eastAsia="Arial" w:hAnsi="Arial"/>
+                <w:b w:val="1"/>
+                <w:sz w:val="24"/>
+                <w:szCs w:val="24"/>
+                <w:rtl w:val="0"/>
+              </w:rPr>
+              <w:delText xml:space="preserve">domínios</w:delText>
+            </w:r>
+          </w:del>
+        </w:sdtContent>
+      </w:sdt>
+      <w:commentRangeEnd w:id="50"/>
+      <w:r>
+        <w:commentReference w:id="50"/>
+      </w:r>
+      <w:commentRangeEnd w:id="49"/>
+      <w:r>
+        <w:commentReference w:id="49"/>
+      </w:r>
+      <w:r>
+        <w:rPr>
+          <w:rtl w:val="0"/>
+        </w:rPr>
+      </w:r>
+    </w:p>
+    <w:p>
+      <w:pPr>
+        <w:spacing w:after="240" w:before="240" w:lineRule="auto"/>
+        <w:jc w:val="both"/>
+        <w:rPr>
+          <w:rFonts w:ascii="Arial" w:cs="Arial" w:eastAsia="Arial" w:hAnsi="Arial"/>
+          <w:sz w:val="24"/>
+          <w:szCs w:val="24"/>
+        </w:rPr>
+      </w:pPr>
+      <w:r>
+        <w:rPr>
+          <w:rFonts w:ascii="Arial" w:cs="Arial" w:eastAsia="Arial" w:hAnsi="Arial"/>
+          <w:sz w:val="24"/>
+          <w:szCs w:val="24"/>
+          <w:rtl w:val="0"/>
+        </w:rPr>
+        <w:t xml:space="preserve">Na área da saúde, a análise de dados tem se tornado um campo fundamental para o monitoramento e tomada de decisões clínicas e epidemiológicas. O uso de dados estruturados permite a criação de modelos, como por exemplo modelos preditivos capazes de identificar padrões em grandes volumes de informações, auxiliando na prevenção e controle de doenças </w:t>
+      </w:r>
+      <w:sdt>
+        <w:sdtPr>
+          <w:tag w:val="goog_rdk_72"/>
+        </w:sdtPr>
+        <w:sdtContent>
+          <w:commentRangeStart w:id="51"/>
+        </w:sdtContent>
+      </w:sdt>
+      <w:r>
+        <w:rPr>
+          <w:rFonts w:ascii="Arial" w:cs="Arial" w:eastAsia="Arial" w:hAnsi="Arial"/>
           <w:sz w:val="24"/>
           <w:szCs w:val="24"/>
           <w:rtl w:val="0"/>
         </w:rPr>
         <w:t xml:space="preserve">(Belini, Ataide e Lochter, 2024)</w:t>
       </w:r>
-      <w:commentRangeEnd w:id="48"/>
-      <w:r>
-        <w:commentReference w:id="48"/>
+      <w:commentRangeEnd w:id="51"/>
+      <w:r>
+        <w:commentReference w:id="51"/>
       </w:r>
       <w:r>
         <w:rPr>
@@ -5967,14 +6170,14 @@
     </w:p>
     <w:sdt>
       <w:sdtPr>
-        <w:tag w:val="goog_rdk_65"/>
+        <w:tag w:val="goog_rdk_75"/>
       </w:sdtPr>
       <w:sdtContent>
         <w:p>
           <w:pPr>
             <w:ind w:left="708" w:firstLine="0"/>
             <w:rPr>
-              <w:del w:author="Iasmin Marques" w:id="6" w:date="2025-03-07T19:30:47Z"/>
+              <w:del w:author="Iasmin Marques" w:id="9" w:date="2025-03-07T19:30:47Z"/>
               <w:rFonts w:ascii="Arial" w:cs="Arial" w:eastAsia="Arial" w:hAnsi="Arial"/>
               <w:sz w:val="24"/>
               <w:szCs w:val="24"/>
@@ -5982,10 +6185,10 @@
           </w:pPr>
           <w:sdt>
             <w:sdtPr>
-              <w:tag w:val="goog_rdk_64"/>
+              <w:tag w:val="goog_rdk_74"/>
             </w:sdtPr>
             <w:sdtContent>
-              <w:del w:author="Iasmin Marques" w:id="6" w:date="2025-03-07T19:30:47Z">
+              <w:del w:author="Iasmin Marques" w:id="9" w:date="2025-03-07T19:30:47Z">
                 <w:r>
                   <w:rPr>
                     <w:rFonts w:ascii="Arial" w:cs="Arial" w:eastAsia="Arial" w:hAnsi="Arial"/>
@@ -6013,10 +6216,10 @@
       </w:pPr>
       <w:sdt>
         <w:sdtPr>
-          <w:tag w:val="goog_rdk_66"/>
+          <w:tag w:val="goog_rdk_76"/>
         </w:sdtPr>
         <w:sdtContent>
-          <w:del w:author="Iasmin Marques" w:id="6" w:date="2025-03-07T19:30:47Z">
+          <w:del w:author="Iasmin Marques" w:id="9" w:date="2025-03-07T19:30:47Z">
             <w:r>
               <w:rPr>
                 <w:rFonts w:ascii="Arial" w:cs="Arial" w:eastAsia="Arial" w:hAnsi="Arial"/>
@@ -6048,13 +6251,13 @@
           </w:del>
           <w:sdt>
             <w:sdtPr>
-              <w:tag w:val="goog_rdk_67"/>
+              <w:tag w:val="goog_rdk_77"/>
             </w:sdtPr>
             <w:sdtContent>
-              <w:commentRangeStart w:id="49"/>
+              <w:commentRangeStart w:id="52"/>
             </w:sdtContent>
           </w:sdt>
-          <w:del w:author="Iasmin Marques" w:id="6" w:date="2025-03-07T19:30:47Z">
+          <w:del w:author="Iasmin Marques" w:id="9" w:date="2025-03-07T19:30:47Z">
             <w:r>
               <w:rPr>
                 <w:rFonts w:ascii="Arial" w:cs="Arial" w:eastAsia="Arial" w:hAnsi="Arial"/>
@@ -6067,9 +6270,9 @@
           </w:del>
         </w:sdtContent>
       </w:sdt>
-      <w:commentRangeEnd w:id="49"/>
-      <w:r>
-        <w:commentReference w:id="49"/>
+      <w:commentRangeEnd w:id="52"/>
+      <w:r>
+        <w:commentReference w:id="52"/>
       </w:r>
       <w:r>
         <w:rPr>
@@ -6148,14 +6351,14 @@
           <w:rFonts w:ascii="Arial" w:cs="Arial" w:eastAsia="Arial" w:hAnsi="Arial"/>
           <w:rtl w:val="0"/>
         </w:rPr>
-        <w:t xml:space="preserve">A análise de dados envolve diversas abordagens que permitem extrair informações relevantes de grandes volumes de dados. Técnicas estatísticas e de aprendizado de máquina desempenham um papel fundamental nesse processo, possibilitando a identificação de padrões e a construção de modelos para diferentes aplicações, desde previsão e classificação até agrupamento e detecção de anomalias </w:t>
+        <w:t xml:space="preserve">A análise de dados envolve muitas abordagens que permitem extrair informações relevantes de grandes volumes de dados. Técnicas estatísticas e de aprendizado de máquina desempenham um papel fundamental nesse processo, pois possibilitam a  construção de modelos e identificação de padrões diferentes aplicações, desde classificação e previsão até agrupamento e detecção de anomalias </w:t>
       </w:r>
       <w:sdt>
         <w:sdtPr>
-          <w:tag w:val="goog_rdk_68"/>
+          <w:tag w:val="goog_rdk_78"/>
         </w:sdtPr>
         <w:sdtContent>
-          <w:commentRangeStart w:id="50"/>
+          <w:commentRangeStart w:id="53"/>
         </w:sdtContent>
       </w:sdt>
       <w:r>
@@ -6165,9 +6368,9 @@
         </w:rPr>
         <w:t xml:space="preserve">(Sena, 2021).</w:t>
       </w:r>
-      <w:commentRangeEnd w:id="50"/>
-      <w:r>
-        <w:commentReference w:id="50"/>
+      <w:commentRangeEnd w:id="53"/>
+      <w:r>
+        <w:commentReference w:id="53"/>
       </w:r>
       <w:r>
         <w:rPr>
@@ -6197,18 +6400,18 @@
       </w:r>
       <w:sdt>
         <w:sdtPr>
-          <w:tag w:val="goog_rdk_69"/>
+          <w:tag w:val="goog_rdk_79"/>
         </w:sdtPr>
         <w:sdtContent>
-          <w:commentRangeStart w:id="51"/>
+          <w:commentRangeStart w:id="54"/>
         </w:sdtContent>
       </w:sdt>
       <w:sdt>
         <w:sdtPr>
-          <w:tag w:val="goog_rdk_70"/>
+          <w:tag w:val="goog_rdk_80"/>
         </w:sdtPr>
         <w:sdtContent>
-          <w:commentRangeStart w:id="52"/>
+          <w:commentRangeStart w:id="55"/>
         </w:sdtContent>
       </w:sdt>
       <w:r>
@@ -6221,13 +6424,77 @@
         </w:rPr>
         <w:t xml:space="preserve">ALGORITMOS</w:t>
       </w:r>
-      <w:commentRangeEnd w:id="51"/>
-      <w:r>
-        <w:commentReference w:id="51"/>
-      </w:r>
-      <w:commentRangeEnd w:id="52"/>
-      <w:r>
-        <w:commentReference w:id="52"/>
+      <w:commentRangeEnd w:id="54"/>
+      <w:r>
+        <w:commentReference w:id="54"/>
+      </w:r>
+      <w:commentRangeEnd w:id="55"/>
+      <w:r>
+        <w:commentReference w:id="55"/>
+      </w:r>
+      <w:r>
+        <w:rPr>
+          <w:rtl w:val="0"/>
+        </w:rPr>
+      </w:r>
+    </w:p>
+    <w:p>
+      <w:pPr>
+        <w:ind w:left="0" w:firstLine="720"/>
+        <w:rPr>
+          <w:rFonts w:ascii="Arial" w:cs="Arial" w:eastAsia="Arial" w:hAnsi="Arial"/>
+          <w:b w:val="1"/>
+          <w:sz w:val="24"/>
+          <w:szCs w:val="24"/>
+        </w:rPr>
+      </w:pPr>
+      <w:r>
+        <w:rPr>
+          <w:rtl w:val="0"/>
+        </w:rPr>
+      </w:r>
+    </w:p>
+    <w:p>
+      <w:pPr>
+        <w:ind w:left="0" w:firstLine="720"/>
+        <w:rPr>
+          <w:rFonts w:ascii="Arial" w:cs="Arial" w:eastAsia="Arial" w:hAnsi="Arial"/>
+          <w:b w:val="1"/>
+          <w:sz w:val="24"/>
+          <w:szCs w:val="24"/>
+        </w:rPr>
+      </w:pPr>
+      <w:r>
+        <w:rPr>
+          <w:rFonts w:ascii="Arial" w:cs="Arial" w:eastAsia="Arial" w:hAnsi="Arial"/>
+          <w:b w:val="1"/>
+          <w:sz w:val="24"/>
+          <w:szCs w:val="24"/>
+          <w:rtl w:val="0"/>
+        </w:rPr>
+        <w:t xml:space="preserve">(</w:t>
+      </w:r>
+      <w:sdt>
+        <w:sdtPr>
+          <w:tag w:val="goog_rdk_81"/>
+        </w:sdtPr>
+        <w:sdtContent>
+          <w:commentRangeStart w:id="56"/>
+        </w:sdtContent>
+      </w:sdt>
+      <w:r>
+        <w:rPr>
+          <w:rFonts w:ascii="Arial" w:cs="Arial" w:eastAsia="Arial" w:hAnsi="Arial"/>
+          <w:b w:val="1"/>
+          <w:sz w:val="24"/>
+          <w:szCs w:val="24"/>
+          <w:rtl w:val="0"/>
+        </w:rPr>
+        <w:t xml:space="preserve">Adicionar os algoritmos listados no chat gpt)</w:t>
+      </w:r>
+      <w:commentRangeEnd w:id="56"/>
+      <w:r>
+        <w:commentReference w:id="56"/>
       </w:r>
       <w:r>
         <w:rPr>
@@ -6274,10 +6541,10 @@
       </w:r>
       <w:sdt>
         <w:sdtPr>
-          <w:tag w:val="goog_rdk_71"/>
+          <w:tag w:val="goog_rdk_82"/>
         </w:sdtPr>
         <w:sdtContent>
-          <w:commentRangeStart w:id="53"/>
+          <w:commentRangeStart w:id="57"/>
         </w:sdtContent>
       </w:sdt>
       <w:r>
@@ -6286,9 +6553,9 @@
         </w:rPr>
         <w:t xml:space="preserve">(Silva e Silva Neto, 2022)</w:t>
       </w:r>
-      <w:commentRangeEnd w:id="53"/>
-      <w:r>
-        <w:commentReference w:id="53"/>
+      <w:commentRangeEnd w:id="57"/>
+      <w:r>
+        <w:commentReference w:id="57"/>
       </w:r>
       <w:r>
         <w:rPr>
@@ -6328,7 +6595,7 @@
       <w:pPr>
         <w:numPr>
           <w:ilvl w:val="0"/>
-          <w:numId w:val="16"/>
+          <w:numId w:val="15"/>
         </w:numPr>
         <w:spacing w:after="0" w:afterAutospacing="0" w:before="240" w:lineRule="auto"/>
         <w:ind w:left="720" w:hanging="360"/>
@@ -6341,10 +6608,10 @@
       </w:r>
       <w:sdt>
         <w:sdtPr>
-          <w:tag w:val="goog_rdk_72"/>
+          <w:tag w:val="goog_rdk_83"/>
         </w:sdtPr>
         <w:sdtContent>
-          <w:commentRangeStart w:id="54"/>
+          <w:commentRangeStart w:id="58"/>
         </w:sdtContent>
       </w:sdt>
       <w:r>
@@ -6353,9 +6620,9 @@
         </w:rPr>
         <w:t xml:space="preserve">(Belini, Ataide e Lochter, 2024).</w:t>
       </w:r>
-      <w:commentRangeEnd w:id="54"/>
-      <w:r>
-        <w:commentReference w:id="54"/>
+      <w:commentRangeEnd w:id="58"/>
+      <w:r>
+        <w:commentReference w:id="58"/>
       </w:r>
       <w:r>
         <w:rPr>
@@ -6403,10 +6670,10 @@
       </w:pPr>
       <w:sdt>
         <w:sdtPr>
-          <w:tag w:val="goog_rdk_73"/>
+          <w:tag w:val="goog_rdk_84"/>
         </w:sdtPr>
         <w:sdtContent>
-          <w:commentRangeStart w:id="55"/>
+          <w:commentRangeStart w:id="59"/>
         </w:sdtContent>
       </w:sdt>
       <w:r>
@@ -6418,9 +6685,9 @@
         </w:rPr>
         <w:t xml:space="preserve">3.5.1.3 XGBoost</w:t>
       </w:r>
-      <w:commentRangeEnd w:id="55"/>
-      <w:r>
-        <w:commentReference w:id="55"/>
+      <w:commentRangeEnd w:id="59"/>
+      <w:r>
+        <w:commentReference w:id="59"/>
       </w:r>
       <w:r>
         <w:rPr>
@@ -6445,10 +6712,10 @@
       </w:r>
       <w:sdt>
         <w:sdtPr>
-          <w:tag w:val="goog_rdk_74"/>
+          <w:tag w:val="goog_rdk_85"/>
         </w:sdtPr>
         <w:sdtContent>
-          <w:commentRangeStart w:id="56"/>
+          <w:commentRangeStart w:id="60"/>
         </w:sdtContent>
       </w:sdt>
       <w:r>
@@ -6457,9 +6724,9 @@
         </w:rPr>
         <w:t xml:space="preserve">(Silva, 2021)</w:t>
       </w:r>
-      <w:commentRangeEnd w:id="56"/>
-      <w:r>
-        <w:commentReference w:id="56"/>
+      <w:commentRangeEnd w:id="60"/>
+      <w:r>
+        <w:commentReference w:id="60"/>
       </w:r>
       <w:r>
         <w:rPr>
@@ -6510,10 +6777,10 @@
       </w:r>
       <w:sdt>
         <w:sdtPr>
-          <w:tag w:val="goog_rdk_75"/>
+          <w:tag w:val="goog_rdk_86"/>
         </w:sdtPr>
         <w:sdtContent>
-          <w:commentRangeStart w:id="57"/>
+          <w:commentRangeStart w:id="61"/>
         </w:sdtContent>
       </w:sdt>
       <w:r>
@@ -6522,9 +6789,9 @@
         </w:rPr>
         <w:t xml:space="preserve"> (Júnior, 2024)</w:t>
       </w:r>
-      <w:commentRangeEnd w:id="57"/>
-      <w:r>
-        <w:commentReference w:id="57"/>
+      <w:commentRangeEnd w:id="61"/>
+      <w:r>
+        <w:commentReference w:id="61"/>
       </w:r>
       <w:r>
         <w:rPr>
@@ -6560,10 +6827,10 @@
       </w:pPr>
       <w:sdt>
         <w:sdtPr>
-          <w:tag w:val="goog_rdk_76"/>
+          <w:tag w:val="goog_rdk_87"/>
         </w:sdtPr>
         <w:sdtContent>
-          <w:commentRangeStart w:id="58"/>
+          <w:commentRangeStart w:id="62"/>
         </w:sdtContent>
       </w:sdt>
       <w:r>
@@ -6594,9 +6861,9 @@
         </w:rPr>
         <w:t xml:space="preserve">Support Vector Machine (SVM) e k-Nearest Neighbor (kNN)  </w:t>
       </w:r>
-      <w:commentRangeEnd w:id="58"/>
-      <w:r>
-        <w:commentReference w:id="58"/>
+      <w:commentRangeEnd w:id="62"/>
+      <w:r>
+        <w:commentReference w:id="62"/>
       </w:r>
       <w:r>
         <w:rPr>
@@ -6615,10 +6882,10 @@
       </w:pPr>
       <w:sdt>
         <w:sdtPr>
-          <w:tag w:val="goog_rdk_77"/>
+          <w:tag w:val="goog_rdk_88"/>
         </w:sdtPr>
         <w:sdtContent>
-          <w:commentRangeStart w:id="59"/>
+          <w:commentRangeStart w:id="63"/>
         </w:sdtContent>
       </w:sdt>
       <w:r>
@@ -6668,9 +6935,9 @@
         </w:rPr>
         <w:t xml:space="preserve"> classifica novas amostras com base na proximidade em relação aos vizinhos mais próximos, sendo útil para tarefas de reconhecimento de padrões. Estudos indicam que o SVM e o kNN apresentam bom desempenho quando há um grande volume de dados disponíveis e a separação entre as classes é bem definida. </w:t>
       </w:r>
-      <w:commentRangeEnd w:id="59"/>
-      <w:r>
-        <w:commentReference w:id="59"/>
+      <w:commentRangeEnd w:id="63"/>
+      <w:r>
+        <w:commentReference w:id="63"/>
       </w:r>
       <w:r>
         <w:rPr>
@@ -6711,10 +6978,10 @@
       </w:r>
       <w:sdt>
         <w:sdtPr>
-          <w:tag w:val="goog_rdk_78"/>
+          <w:tag w:val="goog_rdk_89"/>
         </w:sdtPr>
         <w:sdtContent>
-          <w:commentRangeStart w:id="60"/>
+          <w:commentRangeStart w:id="64"/>
         </w:sdtContent>
       </w:sdt>
       <w:r>
@@ -6726,9 +6993,9 @@
         </w:rPr>
         <w:t xml:space="preserve"> (Silva, 2021)</w:t>
       </w:r>
-      <w:commentRangeEnd w:id="60"/>
-      <w:r>
-        <w:commentReference w:id="60"/>
+      <w:commentRangeEnd w:id="64"/>
+      <w:r>
+        <w:commentReference w:id="64"/>
       </w:r>
       <w:r>
         <w:rPr>
@@ -6762,10 +7029,10 @@
       </w:r>
       <w:sdt>
         <w:sdtPr>
-          <w:tag w:val="goog_rdk_79"/>
+          <w:tag w:val="goog_rdk_90"/>
         </w:sdtPr>
         <w:sdtContent>
-          <w:commentRangeStart w:id="61"/>
+          <w:commentRangeStart w:id="65"/>
         </w:sdtContent>
       </w:sdt>
       <w:r>
@@ -6777,9 +7044,9 @@
         </w:rPr>
         <w:t xml:space="preserve">(Silva, 2021).</w:t>
       </w:r>
-      <w:commentRangeEnd w:id="61"/>
-      <w:r>
-        <w:commentReference w:id="61"/>
+      <w:commentRangeEnd w:id="65"/>
+      <w:r>
+        <w:commentReference w:id="65"/>
       </w:r>
       <w:r>
         <w:rPr>
@@ -6854,10 +7121,10 @@
       </w:r>
       <w:sdt>
         <w:sdtPr>
-          <w:tag w:val="goog_rdk_80"/>
+          <w:tag w:val="goog_rdk_91"/>
         </w:sdtPr>
         <w:sdtContent>
-          <w:commentRangeStart w:id="62"/>
+          <w:commentRangeStart w:id="66"/>
         </w:sdtContent>
       </w:sdt>
       <w:r>
@@ -6866,9 +7133,9 @@
         </w:rPr>
         <w:t xml:space="preserve">(Silva e Silva Neto, 2022</w:t>
       </w:r>
-      <w:commentRangeEnd w:id="62"/>
-      <w:r>
-        <w:commentReference w:id="62"/>
+      <w:commentRangeEnd w:id="66"/>
+      <w:r>
+        <w:commentReference w:id="66"/>
       </w:r>
       <w:r>
         <w:rPr>
@@ -6918,18 +7185,18 @@
       </w:r>
       <w:sdt>
         <w:sdtPr>
-          <w:tag w:val="goog_rdk_81"/>
+          <w:tag w:val="goog_rdk_92"/>
         </w:sdtPr>
         <w:sdtContent>
-          <w:commentRangeStart w:id="63"/>
+          <w:commentRangeStart w:id="67"/>
         </w:sdtContent>
       </w:sdt>
       <w:sdt>
         <w:sdtPr>
-          <w:tag w:val="goog_rdk_82"/>
+          <w:tag w:val="goog_rdk_93"/>
         </w:sdtPr>
         <w:sdtContent>
-          <w:commentRangeStart w:id="64"/>
+          <w:commentRangeStart w:id="68"/>
         </w:sdtContent>
       </w:sdt>
       <w:r>
@@ -6942,13 +7209,13 @@
         </w:rPr>
         <w:t xml:space="preserve">APRENDIZADO DE MÁQUINA</w:t>
       </w:r>
-      <w:commentRangeEnd w:id="63"/>
-      <w:r>
-        <w:commentReference w:id="63"/>
-      </w:r>
-      <w:commentRangeEnd w:id="64"/>
-      <w:r>
-        <w:commentReference w:id="64"/>
+      <w:commentRangeEnd w:id="67"/>
+      <w:r>
+        <w:commentReference w:id="67"/>
+      </w:r>
+      <w:commentRangeEnd w:id="68"/>
+      <w:r>
+        <w:commentReference w:id="68"/>
       </w:r>
       <w:r>
         <w:rPr>
@@ -7048,10 +7315,10 @@
       </w:r>
       <w:sdt>
         <w:sdtPr>
-          <w:tag w:val="goog_rdk_83"/>
+          <w:tag w:val="goog_rdk_94"/>
         </w:sdtPr>
         <w:sdtContent>
-          <w:commentRangeStart w:id="65"/>
+          <w:commentRangeStart w:id="69"/>
         </w:sdtContent>
       </w:sdt>
       <w:r>
@@ -7063,9 +7330,9 @@
         </w:rPr>
         <w:t xml:space="preserve"> Vitoria (2022)</w:t>
       </w:r>
-      <w:commentRangeEnd w:id="65"/>
-      <w:r>
-        <w:commentReference w:id="65"/>
+      <w:commentRangeEnd w:id="69"/>
+      <w:r>
+        <w:commentReference w:id="69"/>
       </w:r>
       <w:r>
         <w:rPr>
@@ -7103,10 +7370,10 @@
       </w:r>
       <w:sdt>
         <w:sdtPr>
-          <w:tag w:val="goog_rdk_84"/>
+          <w:tag w:val="goog_rdk_95"/>
         </w:sdtPr>
         <w:sdtContent>
-          <w:commentRangeStart w:id="66"/>
+          <w:commentRangeStart w:id="70"/>
         </w:sdtContent>
       </w:sdt>
       <w:r>
@@ -7119,9 +7386,9 @@
         </w:rPr>
         <w:t xml:space="preserve">(</w:t>
       </w:r>
-      <w:commentRangeEnd w:id="66"/>
-      <w:r>
-        <w:commentReference w:id="66"/>
+      <w:commentRangeEnd w:id="70"/>
+      <w:r>
+        <w:commentReference w:id="70"/>
       </w:r>
       <w:r>
         <w:rPr>
@@ -7131,10 +7398,10 @@
       </w:r>
       <w:sdt>
         <w:sdtPr>
-          <w:tag w:val="goog_rdk_85"/>
+          <w:tag w:val="goog_rdk_96"/>
         </w:sdtPr>
         <w:sdtContent>
-          <w:commentRangeStart w:id="67"/>
+          <w:commentRangeStart w:id="71"/>
         </w:sdtContent>
       </w:sdt>
       <w:r>
@@ -7147,9 +7414,9 @@
         </w:rPr>
         <w:t xml:space="preserve">)</w:t>
       </w:r>
-      <w:commentRangeEnd w:id="67"/>
-      <w:r>
-        <w:commentReference w:id="67"/>
+      <w:commentRangeEnd w:id="71"/>
+      <w:r>
+        <w:commentReference w:id="71"/>
       </w:r>
       <w:r>
         <w:rPr>
@@ -7272,10 +7539,10 @@
       </w:r>
       <w:sdt>
         <w:sdtPr>
-          <w:tag w:val="goog_rdk_86"/>
+          <w:tag w:val="goog_rdk_97"/>
         </w:sdtPr>
         <w:sdtContent>
-          <w:commentRangeStart w:id="68"/>
+          <w:commentRangeStart w:id="72"/>
         </w:sdtContent>
       </w:sdt>
       <w:r>
@@ -7287,9 +7554,9 @@
         </w:rPr>
         <w:t xml:space="preserve">Vitoria (2022)</w:t>
       </w:r>
-      <w:commentRangeEnd w:id="68"/>
-      <w:r>
-        <w:commentReference w:id="68"/>
+      <w:commentRangeEnd w:id="72"/>
+      <w:r>
+        <w:commentReference w:id="72"/>
       </w:r>
       <w:r>
         <w:rPr>
@@ -7327,10 +7594,10 @@
       </w:r>
       <w:sdt>
         <w:sdtPr>
-          <w:tag w:val="goog_rdk_87"/>
+          <w:tag w:val="goog_rdk_98"/>
         </w:sdtPr>
         <w:sdtContent>
-          <w:commentRangeStart w:id="69"/>
+          <w:commentRangeStart w:id="73"/>
         </w:sdtContent>
       </w:sdt>
       <w:r>
@@ -7342,9 +7609,9 @@
         </w:rPr>
         <w:t xml:space="preserve">Vitoria (2022</w:t>
       </w:r>
-      <w:commentRangeEnd w:id="69"/>
-      <w:r>
-        <w:commentReference w:id="69"/>
+      <w:commentRangeEnd w:id="73"/>
+      <w:r>
+        <w:commentReference w:id="73"/>
       </w:r>
       <w:r>
         <w:rPr>
@@ -7382,10 +7649,10 @@
       </w:pPr>
       <w:sdt>
         <w:sdtPr>
-          <w:tag w:val="goog_rdk_88"/>
+          <w:tag w:val="goog_rdk_99"/>
         </w:sdtPr>
         <w:sdtContent>
-          <w:commentRangeStart w:id="70"/>
+          <w:commentRangeStart w:id="74"/>
         </w:sdtContent>
       </w:sdt>
       <w:r>
@@ -7409,9 +7676,9 @@
         </w:rPr>
         <w:t xml:space="preserve">A comparação entre diferentes modelos preditivos é essencial para determinar qual apresenta melhor desempenho em um determinado problema. Métricas como acurácia, precisão, recall e AUC-ROC são utilizadas para essa avaliação (Silva e Silva Neto, 2022)</w:t>
       </w:r>
-      <w:commentRangeEnd w:id="70"/>
-      <w:r>
-        <w:commentReference w:id="70"/>
+      <w:commentRangeEnd w:id="74"/>
+      <w:r>
+        <w:commentReference w:id="74"/>
       </w:r>
       <w:r>
         <w:rPr>
@@ -7499,14 +7766,33 @@
           <w:szCs w:val="24"/>
           <w:rtl w:val="0"/>
         </w:rPr>
-        <w:t xml:space="preserve">Investigar e definir uma abordagem metodológica para a análise preditiva de desfechos clínicos em pacientes com Síndrome Respiratória Aguda Grave (SRAG), por meio de técnicas de </w:t>
+        <w:t xml:space="preserve">Investigar e definir uma abordagem metodológica para a </w:t>
+      </w:r>
+      <w:r>
+        <w:rPr>
+          <w:rFonts w:ascii="Arial" w:cs="Arial" w:eastAsia="Arial" w:hAnsi="Arial"/>
+          <w:b w:val="1"/>
+          <w:sz w:val="24"/>
+          <w:szCs w:val="24"/>
+          <w:rtl w:val="0"/>
+        </w:rPr>
+        <w:t xml:space="preserve">análise preditiva</w:t>
+      </w:r>
+      <w:r>
+        <w:rPr>
+          <w:rFonts w:ascii="Arial" w:cs="Arial" w:eastAsia="Arial" w:hAnsi="Arial"/>
+          <w:sz w:val="24"/>
+          <w:szCs w:val="24"/>
+          <w:rtl w:val="0"/>
+        </w:rPr>
+        <w:t xml:space="preserve"> de desfechos clínicos em pacientes com Síndrome Respiratória Aguda Grave (SRAG), por meio de técnicas de </w:t>
       </w:r>
       <w:sdt>
         <w:sdtPr>
-          <w:tag w:val="goog_rdk_89"/>
+          <w:tag w:val="goog_rdk_100"/>
         </w:sdtPr>
         <w:sdtContent>
-          <w:commentRangeStart w:id="71"/>
+          <w:commentRangeStart w:id="75"/>
         </w:sdtContent>
       </w:sdt>
       <w:r>
@@ -7518,9 +7804,9 @@
         </w:rPr>
         <w:t xml:space="preserve">Ciência/ análise</w:t>
       </w:r>
-      <w:commentRangeEnd w:id="71"/>
-      <w:r>
-        <w:commentReference w:id="71"/>
+      <w:commentRangeEnd w:id="75"/>
+      <w:r>
+        <w:commentReference w:id="75"/>
       </w:r>
       <w:r>
         <w:rPr>
@@ -7637,10 +7923,10 @@
       </w:pPr>
       <w:sdt>
         <w:sdtPr>
-          <w:tag w:val="goog_rdk_90"/>
+          <w:tag w:val="goog_rdk_101"/>
         </w:sdtPr>
         <w:sdtContent>
-          <w:commentRangeStart w:id="72"/>
+          <w:commentRangeStart w:id="76"/>
         </w:sdtContent>
       </w:sdt>
       <w:r>
@@ -7652,9 +7938,9 @@
         </w:rPr>
         <w:t xml:space="preserve">Estudar as etapas da descoberta de conhecimento em banco de dados</w:t>
       </w:r>
-      <w:commentRangeEnd w:id="72"/>
-      <w:r>
-        <w:commentReference w:id="72"/>
+      <w:commentRangeEnd w:id="76"/>
+      <w:r>
+        <w:commentReference w:id="76"/>
       </w:r>
       <w:r>
         <w:rPr>
@@ -7678,10 +7964,10 @@
       </w:pPr>
       <w:sdt>
         <w:sdtPr>
-          <w:tag w:val="goog_rdk_91"/>
+          <w:tag w:val="goog_rdk_102"/>
         </w:sdtPr>
         <w:sdtContent>
-          <w:commentRangeStart w:id="73"/>
+          <w:commentRangeStart w:id="77"/>
         </w:sdtContent>
       </w:sdt>
       <w:r>
@@ -7693,9 +7979,9 @@
         </w:rPr>
         <w:t xml:space="preserve">Analisar material bibliográfico que utilizam aprendizado de máquina para a predição de desfechos clínicos, identificando metodologias, técnicas e modelos utilizados.</w:t>
       </w:r>
-      <w:commentRangeEnd w:id="73"/>
-      <w:r>
-        <w:commentReference w:id="73"/>
+      <w:commentRangeEnd w:id="77"/>
+      <w:r>
+        <w:commentReference w:id="77"/>
       </w:r>
       <w:r>
         <w:rPr>
@@ -7794,17 +8080,23 @@
     <w:p>
       <w:pPr>
         <w:ind w:left="0" w:firstLine="0"/>
-        <w:rPr>
-          <w:rFonts w:ascii="Arial" w:cs="Arial" w:eastAsia="Arial" w:hAnsi="Arial"/>
-          <w:b w:val="1"/>
-          <w:sz w:val="24"/>
-          <w:szCs w:val="24"/>
-        </w:rPr>
-      </w:pPr>
-      <w:r>
-        <w:rPr>
-          <w:rtl w:val="0"/>
-        </w:rPr>
+        <w:jc w:val="both"/>
+        <w:rPr>
+          <w:rFonts w:ascii="Arial" w:cs="Arial" w:eastAsia="Arial" w:hAnsi="Arial"/>
+          <w:sz w:val="24"/>
+          <w:szCs w:val="24"/>
+          <w:shd w:fill="b6d7a8" w:val="clear"/>
+        </w:rPr>
+      </w:pPr>
+      <w:r>
+        <w:rPr>
+          <w:rFonts w:ascii="Arial" w:cs="Arial" w:eastAsia="Arial" w:hAnsi="Arial"/>
+          <w:sz w:val="24"/>
+          <w:szCs w:val="24"/>
+          <w:shd w:fill="b6d7a8" w:val="clear"/>
+          <w:rtl w:val="0"/>
+        </w:rPr>
+        <w:t xml:space="preserve">Inicialmente, foi realizada revisão bibliográfica de artigos publicados entre 2020 e 2025 em periódicos disponíveis nas bases de dados da CAPES e do Google Acadêmico, de modo a construir uma fundamentação teórica sólida e construtiva.</w:t>
       </w:r>
     </w:p>
     <w:p>
@@ -7826,7 +8118,7 @@
           <w:shd w:fill="b6d7a8" w:val="clear"/>
           <w:rtl w:val="0"/>
         </w:rPr>
-        <w:t xml:space="preserve">Inicialmente, foi realizada revisão bibliográfica de artigos publicados entre 2015 e 2021 em periódicos disponíveis nas bases de dados da CAPES e do Google Acadêmico, de modo a construir uma fundamentação teórica sólida e construtiva.</w:t>
+        <w:t xml:space="preserve">Para encontrar periódicos, os seguintes descritores foram utilizados, tanto em português brasileiro quanto em inglês: SRAG; análise de dados; análise de dados na área da saúde; Modelos de aprendizagem; Modelos de predição; Ciência de dados. Os artigos selecionados foram estudados, fichados e organizados de modo que possam ser facilmente consultados posteriormente.</w:t>
       </w:r>
     </w:p>
     <w:p>
@@ -7842,8 +8134,13 @@
       </w:pPr>
       <w:r>
         <w:rPr>
-          <w:rtl w:val="0"/>
-        </w:rPr>
+          <w:rFonts w:ascii="Arial" w:cs="Arial" w:eastAsia="Arial" w:hAnsi="Arial"/>
+          <w:sz w:val="24"/>
+          <w:szCs w:val="24"/>
+          <w:shd w:fill="b6d7a8" w:val="clear"/>
+          <w:rtl w:val="0"/>
+        </w:rPr>
+        <w:t xml:space="preserve">Através da revisão bibliográfica, foram estudadas técnicas de Ciência e Análise de dados, das quais serão escolhidas as que ofereçam aplicabilidade geral ou específica ao contexto da Síndrome respiratória aguda grave. A revisão bibliográfica prosseguirá nas fases subsequentes do projeto conforme a necessidade.</w:t>
       </w:r>
     </w:p>
     <w:p>
@@ -7859,13 +8156,68 @@
       </w:pPr>
       <w:r>
         <w:rPr>
-          <w:rFonts w:ascii="Arial" w:cs="Arial" w:eastAsia="Arial" w:hAnsi="Arial"/>
-          <w:sz w:val="24"/>
-          <w:szCs w:val="24"/>
-          <w:shd w:fill="b6d7a8" w:val="clear"/>
-          <w:rtl w:val="0"/>
-        </w:rPr>
-        <w:t xml:space="preserve">Para encontrar periódicos, os seguintes descritores foram utilizados, tanto em português brasileiro quanto em inglês: SRAG; análise de dados; análise de dados na área da saúde; Modelos de aprendizagem; Modelos de predição; Ciência de dados. Os artigos selecionados foram estudados, fichados e organizados de modo que possam ser facilmente consultados posteriormente.</w:t>
+          <w:rtl w:val="0"/>
+        </w:rPr>
+      </w:r>
+    </w:p>
+    <w:p>
+      <w:pPr>
+        <w:ind w:left="0" w:firstLine="0"/>
+        <w:rPr>
+          <w:rFonts w:ascii="Arial" w:cs="Arial" w:eastAsia="Arial" w:hAnsi="Arial"/>
+          <w:b w:val="1"/>
+          <w:sz w:val="24"/>
+          <w:szCs w:val="24"/>
+        </w:rPr>
+      </w:pPr>
+      <w:r>
+        <w:rPr>
+          <w:rFonts w:ascii="Arial" w:cs="Arial" w:eastAsia="Arial" w:hAnsi="Arial"/>
+          <w:b w:val="1"/>
+          <w:sz w:val="24"/>
+          <w:szCs w:val="24"/>
+          <w:rtl w:val="0"/>
+        </w:rPr>
+        <w:t xml:space="preserve">5.1 Tipo de Pesquisa</w:t>
+      </w:r>
+    </w:p>
+    <w:p>
+      <w:pPr>
+        <w:spacing w:after="240" w:before="240" w:lineRule="auto"/>
+        <w:jc w:val="both"/>
+        <w:rPr>
+          <w:rFonts w:ascii="Arial" w:cs="Arial" w:eastAsia="Arial" w:hAnsi="Arial"/>
+          <w:sz w:val="24"/>
+          <w:szCs w:val="24"/>
+        </w:rPr>
+      </w:pPr>
+      <w:r>
+        <w:rPr>
+          <w:rFonts w:ascii="Arial" w:cs="Arial" w:eastAsia="Arial" w:hAnsi="Arial"/>
+          <w:sz w:val="24"/>
+          <w:szCs w:val="24"/>
+          <w:rtl w:val="0"/>
+        </w:rPr>
+        <w:t xml:space="preserve">Este estudo se caracteriza como uma pesquisa aplicada com uma abordagem exploratória e quantitativa. A pesquisa exploratória é justificada pela necessidade de investigação de padrões e informações nos dados de SRAG, podendo-se avaliar a eficiência e eficácia de diferentes modelos. Já a pesquisa aplicada possui o intuito de gerar conhecimento para </w:t>
+      </w:r>
+      <w:r>
+        <w:rPr>
+          <w:rFonts w:ascii="Arial" w:cs="Arial" w:eastAsia="Arial" w:hAnsi="Arial"/>
+          <w:b w:val="1"/>
+          <w:sz w:val="24"/>
+          <w:szCs w:val="24"/>
+          <w:rtl w:val="0"/>
+        </w:rPr>
+        <w:t xml:space="preserve">praticabilidade</w:t>
+      </w:r>
+      <w:r>
+        <w:rPr>
+          <w:rFonts w:ascii="Arial" w:cs="Arial" w:eastAsia="Arial" w:hAnsi="Arial"/>
+          <w:sz w:val="24"/>
+          <w:szCs w:val="24"/>
+          <w:rtl w:val="0"/>
+        </w:rPr>
+        <w:t xml:space="preserve"> na área da saúde, enquanto a abordagem quantitativa permite a análise estatística dos dados disponíveis. </w:t>
       </w:r>
     </w:p>
     <w:p>
@@ -7874,396 +8226,463 @@
         <w:jc w:val="both"/>
         <w:rPr>
           <w:rFonts w:ascii="Arial" w:cs="Arial" w:eastAsia="Arial" w:hAnsi="Arial"/>
+          <w:b w:val="1"/>
+          <w:sz w:val="24"/>
+          <w:szCs w:val="24"/>
+        </w:rPr>
+      </w:pPr>
+      <w:r>
+        <w:rPr>
+          <w:rFonts w:ascii="Arial" w:cs="Arial" w:eastAsia="Arial" w:hAnsi="Arial"/>
+          <w:b w:val="1"/>
+          <w:sz w:val="24"/>
+          <w:szCs w:val="24"/>
+          <w:rtl w:val="0"/>
+        </w:rPr>
+        <w:t xml:space="preserve">5.2 Objetivo da Pesquisa</w:t>
+      </w:r>
+    </w:p>
+    <w:p>
+      <w:pPr>
+        <w:spacing w:after="240" w:before="240" w:lineRule="auto"/>
+        <w:jc w:val="both"/>
+        <w:rPr>
+          <w:rFonts w:ascii="Arial" w:cs="Arial" w:eastAsia="Arial" w:hAnsi="Arial"/>
+          <w:sz w:val="24"/>
+          <w:szCs w:val="24"/>
+        </w:rPr>
+      </w:pPr>
+      <w:r>
+        <w:rPr>
+          <w:rFonts w:ascii="Arial" w:cs="Arial" w:eastAsia="Arial" w:hAnsi="Arial"/>
+          <w:sz w:val="24"/>
+          <w:szCs w:val="24"/>
+          <w:rtl w:val="0"/>
+        </w:rPr>
+        <w:t xml:space="preserve">O objetivo deste estudo é analisar a </w:t>
+      </w:r>
+      <w:r>
+        <w:rPr>
+          <w:rFonts w:ascii="Arial" w:cs="Arial" w:eastAsia="Arial" w:hAnsi="Arial"/>
           <w:sz w:val="24"/>
           <w:szCs w:val="24"/>
           <w:shd w:fill="b6d7a8" w:val="clear"/>
-        </w:rPr>
-      </w:pPr>
-      <w:r>
-        <w:rPr>
-          <w:rtl w:val="0"/>
-        </w:rPr>
+          <w:rtl w:val="0"/>
+        </w:rPr>
+        <w:t xml:space="preserve">base historia SRAG 2021 a 2024</w:t>
+      </w:r>
+      <w:r>
+        <w:rPr>
+          <w:rFonts w:ascii="Arial" w:cs="Arial" w:eastAsia="Arial" w:hAnsi="Arial"/>
+          <w:sz w:val="24"/>
+          <w:szCs w:val="24"/>
+          <w:rtl w:val="0"/>
+        </w:rPr>
+        <w:t xml:space="preserve"> </w:t>
+      </w:r>
+      <w:r>
+        <w:rPr>
+          <w:rFonts w:ascii="Arial" w:cs="Arial" w:eastAsia="Arial" w:hAnsi="Arial"/>
+          <w:sz w:val="24"/>
+          <w:szCs w:val="24"/>
+          <w:rtl w:val="0"/>
+        </w:rPr>
+        <w:t xml:space="preserve">(disponíveis no DataSUS) e desenvolver um modelo </w:t>
+      </w:r>
+      <w:r>
+        <w:rPr>
+          <w:rFonts w:ascii="Arial" w:cs="Arial" w:eastAsia="Arial" w:hAnsi="Arial"/>
+          <w:b w:val="1"/>
+          <w:sz w:val="24"/>
+          <w:szCs w:val="24"/>
+          <w:rtl w:val="0"/>
+        </w:rPr>
+        <w:t xml:space="preserve">preditivo</w:t>
+      </w:r>
+      <w:r>
+        <w:rPr>
+          <w:rFonts w:ascii="Arial" w:cs="Arial" w:eastAsia="Arial" w:hAnsi="Arial"/>
+          <w:sz w:val="24"/>
+          <w:szCs w:val="24"/>
+          <w:rtl w:val="0"/>
+        </w:rPr>
+        <w:t xml:space="preserve"> para análise de desfechos clínicos em pacientes diagnosticados com SRAG através da identificação e comparação de variáveis (relevantes, ou seja, que influenciam os desfechos clínicos) presentes no </w:t>
+      </w:r>
+      <w:sdt>
+        <w:sdtPr>
+          <w:tag w:val="goog_rdk_103"/>
+        </w:sdtPr>
+        <w:sdtContent>
+          <w:commentRangeStart w:id="78"/>
+        </w:sdtContent>
+      </w:sdt>
+      <w:r>
+        <w:rPr>
+          <w:rFonts w:ascii="Arial" w:cs="Arial" w:eastAsia="Arial" w:hAnsi="Arial"/>
+          <w:i w:val="1"/>
+          <w:sz w:val="24"/>
+          <w:szCs w:val="24"/>
+          <w:rtl w:val="0"/>
+        </w:rPr>
+        <w:t xml:space="preserve">dataset</w:t>
+      </w:r>
+      <w:commentRangeEnd w:id="78"/>
+      <w:r>
+        <w:commentReference w:id="78"/>
+      </w:r>
+      <w:r>
+        <w:rPr>
+          <w:rFonts w:ascii="Arial" w:cs="Arial" w:eastAsia="Arial" w:hAnsi="Arial"/>
+          <w:sz w:val="24"/>
+          <w:szCs w:val="24"/>
+          <w:rtl w:val="0"/>
+        </w:rPr>
+        <w:t xml:space="preserve">,  utilizando técnicas de aprendizado de máquina. E fazer a comparação e análise de diferentes algoritmos para determinar qual apresenta melhor desempenho na predição.</w:t>
+      </w:r>
+    </w:p>
+    <w:p>
+      <w:pPr>
+        <w:spacing w:after="240" w:before="240" w:lineRule="auto"/>
+        <w:jc w:val="both"/>
+        <w:rPr>
+          <w:rFonts w:ascii="Arial" w:cs="Arial" w:eastAsia="Arial" w:hAnsi="Arial"/>
+          <w:sz w:val="24"/>
+          <w:szCs w:val="24"/>
+        </w:rPr>
+      </w:pPr>
+      <w:r>
+        <w:rPr>
+          <w:rtl w:val="0"/>
+        </w:rPr>
+      </w:r>
+    </w:p>
+    <w:p>
+      <w:pPr>
+        <w:spacing w:after="240" w:before="240" w:lineRule="auto"/>
+        <w:jc w:val="both"/>
+        <w:rPr>
+          <w:rFonts w:ascii="Arial" w:cs="Arial" w:eastAsia="Arial" w:hAnsi="Arial"/>
+          <w:b w:val="1"/>
+          <w:sz w:val="24"/>
+          <w:szCs w:val="24"/>
+        </w:rPr>
+      </w:pPr>
+      <w:r>
+        <w:rPr>
+          <w:rFonts w:ascii="Arial" w:cs="Arial" w:eastAsia="Arial" w:hAnsi="Arial"/>
+          <w:b w:val="1"/>
+          <w:sz w:val="24"/>
+          <w:szCs w:val="24"/>
+          <w:rtl w:val="0"/>
+        </w:rPr>
+        <w:t xml:space="preserve">5.3 Fonte de Dados</w:t>
+      </w:r>
+    </w:p>
+    <w:p>
+      <w:pPr>
+        <w:spacing w:after="240" w:before="240" w:lineRule="auto"/>
+        <w:jc w:val="both"/>
+        <w:rPr>
+          <w:rFonts w:ascii="Arial" w:cs="Arial" w:eastAsia="Arial" w:hAnsi="Arial"/>
+          <w:b w:val="1"/>
+          <w:sz w:val="24"/>
+          <w:szCs w:val="24"/>
+        </w:rPr>
+      </w:pPr>
+      <w:sdt>
+        <w:sdtPr>
+          <w:tag w:val="goog_rdk_104"/>
+        </w:sdtPr>
+        <w:sdtContent>
+          <w:commentRangeStart w:id="79"/>
+        </w:sdtContent>
+      </w:sdt>
+      <w:r>
+        <w:rPr>
+          <w:rFonts w:ascii="Arial" w:cs="Arial" w:eastAsia="Arial" w:hAnsi="Arial"/>
+          <w:b w:val="1"/>
+          <w:sz w:val="24"/>
+          <w:szCs w:val="24"/>
+          <w:rtl w:val="0"/>
+        </w:rPr>
+        <w:t xml:space="preserve">(Pq foi escolhido esses dados?)</w:t>
+      </w:r>
+      <w:commentRangeEnd w:id="79"/>
+      <w:r>
+        <w:commentReference w:id="79"/>
+      </w:r>
+      <w:r>
+        <w:rPr>
+          <w:rtl w:val="0"/>
+        </w:rPr>
+      </w:r>
+    </w:p>
+    <w:p>
+      <w:pPr>
+        <w:spacing w:after="240" w:before="240" w:lineRule="auto"/>
+        <w:jc w:val="both"/>
+        <w:rPr>
+          <w:rFonts w:ascii="Arial" w:cs="Arial" w:eastAsia="Arial" w:hAnsi="Arial"/>
+          <w:sz w:val="24"/>
+          <w:szCs w:val="24"/>
+        </w:rPr>
+      </w:pPr>
+      <w:r>
+        <w:rPr>
+          <w:rFonts w:ascii="Arial" w:cs="Arial" w:eastAsia="Arial" w:hAnsi="Arial"/>
+          <w:sz w:val="24"/>
+          <w:szCs w:val="24"/>
+          <w:rtl w:val="0"/>
+        </w:rPr>
+        <w:t xml:space="preserve">Os dados utilizados neste estudo serão extraídos do banco de dados do DataSUS, com o foco principal na</w:t>
+      </w:r>
+      <w:r>
+        <w:rPr>
+          <w:rFonts w:ascii="Arial" w:cs="Arial" w:eastAsia="Arial" w:hAnsi="Arial"/>
+          <w:sz w:val="24"/>
+          <w:szCs w:val="24"/>
+          <w:shd w:fill="b6d7a8" w:val="clear"/>
+          <w:rtl w:val="0"/>
+        </w:rPr>
+        <w:t xml:space="preserve"> base historia SRAG 2021 a 2024</w:t>
+      </w:r>
+      <w:r>
+        <w:rPr>
+          <w:rFonts w:ascii="Arial" w:cs="Arial" w:eastAsia="Arial" w:hAnsi="Arial"/>
+          <w:sz w:val="24"/>
+          <w:szCs w:val="24"/>
+          <w:rtl w:val="0"/>
+        </w:rPr>
+        <w:t xml:space="preserve">, que disponibiliza </w:t>
+      </w:r>
+      <w:r>
+        <w:rPr>
+          <w:rFonts w:ascii="Arial" w:cs="Arial" w:eastAsia="Arial" w:hAnsi="Arial"/>
+          <w:sz w:val="24"/>
+          <w:szCs w:val="24"/>
+          <w:rtl w:val="0"/>
+        </w:rPr>
+        <w:t xml:space="preserve">informações de saúde pública no Brasil. </w:t>
+      </w:r>
+    </w:p>
+    <w:p>
+      <w:pPr>
+        <w:spacing w:after="240" w:before="240" w:lineRule="auto"/>
+        <w:jc w:val="both"/>
+        <w:rPr>
+          <w:rFonts w:ascii="Arial" w:cs="Arial" w:eastAsia="Arial" w:hAnsi="Arial"/>
+          <w:sz w:val="24"/>
+          <w:szCs w:val="24"/>
+        </w:rPr>
+      </w:pPr>
+      <w:r>
+        <w:rPr>
+          <w:rFonts w:ascii="Arial" w:cs="Arial" w:eastAsia="Arial" w:hAnsi="Arial"/>
+          <w:sz w:val="24"/>
+          <w:szCs w:val="24"/>
+          <w:rtl w:val="0"/>
+        </w:rPr>
+        <w:t xml:space="preserve">O conjunto de dados contém registros de pacientes diagnosticados com SRAG incluindo variáveis clínicas, epidemiológicas e demográficas. Serão levadas consideração  variáveis como presença de comorbidades, idade, sexo,  uso de ventilação mecânica, internação em UTI e status vacinal contra COVID-19, Influenza, entre outras informações importantes.</w:t>
       </w:r>
     </w:p>
     <w:p>
       <w:pPr>
         <w:ind w:left="0" w:firstLine="0"/>
-        <w:jc w:val="both"/>
-        <w:rPr>
-          <w:rFonts w:ascii="Arial" w:cs="Arial" w:eastAsia="Arial" w:hAnsi="Arial"/>
-          <w:sz w:val="24"/>
-          <w:szCs w:val="24"/>
-          <w:shd w:fill="b6d7a8" w:val="clear"/>
-        </w:rPr>
-      </w:pPr>
-      <w:r>
-        <w:rPr>
-          <w:rFonts w:ascii="Arial" w:cs="Arial" w:eastAsia="Arial" w:hAnsi="Arial"/>
-          <w:sz w:val="24"/>
-          <w:szCs w:val="24"/>
-          <w:shd w:fill="b6d7a8" w:val="clear"/>
-          <w:rtl w:val="0"/>
-        </w:rPr>
-        <w:t xml:space="preserve">Através da revisão bibliográfica, foram estudadas técnicas de Ciência de Dados, das quais serão escolhidas as que ofereçam aplicabilidade geral ou específica ao contexto da Síndrome respiratória aguda grave. A revisão bibliográfica prosseguirá nas fases subsequentes do projeto conforme a necessidade.</w:t>
+        <w:rPr>
+          <w:rFonts w:ascii="Arial" w:cs="Arial" w:eastAsia="Arial" w:hAnsi="Arial"/>
+          <w:b w:val="1"/>
+          <w:sz w:val="24"/>
+          <w:szCs w:val="24"/>
+        </w:rPr>
+      </w:pPr>
+      <w:r>
+        <w:rPr>
+          <w:rtl w:val="0"/>
+        </w:rPr>
       </w:r>
     </w:p>
     <w:p>
       <w:pPr>
         <w:ind w:left="0" w:firstLine="0"/>
-        <w:jc w:val="both"/>
-        <w:rPr>
-          <w:rFonts w:ascii="Arial" w:cs="Arial" w:eastAsia="Arial" w:hAnsi="Arial"/>
-          <w:sz w:val="24"/>
-          <w:szCs w:val="24"/>
-          <w:shd w:fill="b6d7a8" w:val="clear"/>
-        </w:rPr>
-      </w:pPr>
-      <w:r>
-        <w:rPr>
-          <w:rtl w:val="0"/>
-        </w:rPr>
+        <w:rPr>
+          <w:rFonts w:ascii="Arial" w:cs="Arial" w:eastAsia="Arial" w:hAnsi="Arial"/>
+          <w:b w:val="1"/>
+          <w:sz w:val="24"/>
+          <w:szCs w:val="24"/>
+        </w:rPr>
+      </w:pPr>
+      <w:r>
+        <w:rPr>
+          <w:rFonts w:ascii="Arial" w:cs="Arial" w:eastAsia="Arial" w:hAnsi="Arial"/>
+          <w:b w:val="1"/>
+          <w:sz w:val="24"/>
+          <w:szCs w:val="24"/>
+          <w:rtl w:val="0"/>
+        </w:rPr>
+        <w:t xml:space="preserve">5.4 Amostra</w:t>
+      </w:r>
+    </w:p>
+    <w:p>
+      <w:pPr>
+        <w:spacing w:after="240" w:before="240" w:lineRule="auto"/>
+        <w:rPr>
+          <w:rFonts w:ascii="Arial" w:cs="Arial" w:eastAsia="Arial" w:hAnsi="Arial"/>
+          <w:b w:val="1"/>
+          <w:sz w:val="24"/>
+          <w:szCs w:val="24"/>
+        </w:rPr>
+      </w:pPr>
+      <w:r>
+        <w:rPr>
+          <w:rFonts w:ascii="Arial" w:cs="Arial" w:eastAsia="Arial" w:hAnsi="Arial"/>
+          <w:sz w:val="24"/>
+          <w:szCs w:val="24"/>
+          <w:rtl w:val="0"/>
+        </w:rPr>
+        <w:t xml:space="preserve">A amostra será composta por registros de pacientes diagnosticados com </w:t>
+      </w:r>
+      <w:sdt>
+        <w:sdtPr>
+          <w:tag w:val="goog_rdk_105"/>
+        </w:sdtPr>
+        <w:sdtContent>
+          <w:commentRangeStart w:id="80"/>
+        </w:sdtContent>
+      </w:sdt>
+      <w:r>
+        <w:rPr>
+          <w:rFonts w:ascii="Arial" w:cs="Arial" w:eastAsia="Arial" w:hAnsi="Arial"/>
+          <w:b w:val="1"/>
+          <w:sz w:val="24"/>
+          <w:szCs w:val="24"/>
+          <w:rtl w:val="0"/>
+        </w:rPr>
+        <w:t xml:space="preserve">SRAG no ano de 2024</w:t>
+      </w:r>
+      <w:commentRangeEnd w:id="80"/>
+      <w:r>
+        <w:commentReference w:id="80"/>
+      </w:r>
+      <w:r>
+        <w:rPr>
+          <w:rFonts w:ascii="Arial" w:cs="Arial" w:eastAsia="Arial" w:hAnsi="Arial"/>
+          <w:sz w:val="24"/>
+          <w:szCs w:val="24"/>
+          <w:rtl w:val="0"/>
+        </w:rPr>
+        <w:t xml:space="preserve">, totalizando aproximadamente 26.000 registros. </w:t>
+      </w:r>
+      <w:sdt>
+        <w:sdtPr>
+          <w:tag w:val="goog_rdk_106"/>
+        </w:sdtPr>
+        <w:sdtContent>
+          <w:commentRangeStart w:id="81"/>
+        </w:sdtContent>
+      </w:sdt>
+      <w:r>
+        <w:rPr>
+          <w:rFonts w:ascii="Arial" w:cs="Arial" w:eastAsia="Arial" w:hAnsi="Arial"/>
+          <w:b w:val="1"/>
+          <w:sz w:val="24"/>
+          <w:szCs w:val="24"/>
+          <w:rtl w:val="0"/>
+        </w:rPr>
+        <w:t xml:space="preserve">Os critérios de inclusão consideram apenas pacientes com diagnóstico confirmado, enquanto registros incompletos ou inconsistentes serão excluídos ou tratados durante a fase de pré-processamento.</w:t>
+      </w:r>
+      <w:commentRangeEnd w:id="81"/>
+      <w:r>
+        <w:commentReference w:id="81"/>
+      </w:r>
+      <w:r>
+        <w:rPr>
+          <w:rtl w:val="0"/>
+        </w:rPr>
+      </w:r>
+    </w:p>
+    <w:p>
+      <w:pPr>
+        <w:ind w:left="0" w:firstLine="0"/>
+        <w:rPr>
+          <w:rFonts w:ascii="Arial" w:cs="Arial" w:eastAsia="Arial" w:hAnsi="Arial"/>
+          <w:b w:val="1"/>
+          <w:sz w:val="24"/>
+          <w:szCs w:val="24"/>
+        </w:rPr>
+      </w:pPr>
+      <w:r>
+        <w:rPr>
+          <w:rtl w:val="0"/>
+        </w:rPr>
+      </w:r>
+    </w:p>
+    <w:p>
+      <w:pPr>
+        <w:ind w:left="0" w:firstLine="0"/>
+        <w:rPr>
+          <w:rFonts w:ascii="Arial" w:cs="Arial" w:eastAsia="Arial" w:hAnsi="Arial"/>
+          <w:b w:val="1"/>
+          <w:sz w:val="24"/>
+          <w:szCs w:val="24"/>
+        </w:rPr>
+      </w:pPr>
+      <w:r>
+        <w:rPr>
+          <w:rFonts w:ascii="Arial" w:cs="Arial" w:eastAsia="Arial" w:hAnsi="Arial"/>
+          <w:b w:val="1"/>
+          <w:sz w:val="24"/>
+          <w:szCs w:val="24"/>
+          <w:rtl w:val="0"/>
+        </w:rPr>
+        <w:t xml:space="preserve">5.5 Pré-processamento de Dados</w:t>
+      </w:r>
+    </w:p>
+    <w:p>
+      <w:pPr>
+        <w:spacing w:after="240" w:before="240" w:lineRule="auto"/>
+        <w:rPr>
+          <w:rFonts w:ascii="Arial" w:cs="Arial" w:eastAsia="Arial" w:hAnsi="Arial"/>
+          <w:sz w:val="24"/>
+          <w:szCs w:val="24"/>
+        </w:rPr>
+      </w:pPr>
+      <w:r>
+        <w:rPr>
+          <w:rFonts w:ascii="Arial" w:cs="Arial" w:eastAsia="Arial" w:hAnsi="Arial"/>
+          <w:sz w:val="24"/>
+          <w:szCs w:val="24"/>
+          <w:rtl w:val="0"/>
+        </w:rPr>
+        <w:t xml:space="preserve">O pré-processamento dos dados será realizado em etapas para garantir a qualidade e a usabilidade do conjunto de dados, incluindo o tratamento de valores ausentes, normalização de variáveis e balanceamento de classes. </w:t>
       </w:r>
     </w:p>
     <w:p>
       <w:pPr>
         <w:numPr>
           <w:ilvl w:val="0"/>
-          <w:numId w:val="15"/>
-        </w:numPr>
-        <w:spacing w:after="0" w:afterAutospacing="0"/>
-        <w:ind w:left="720" w:hanging="360"/>
-        <w:jc w:val="both"/>
-        <w:rPr>
-          <w:rFonts w:ascii="Arial" w:cs="Arial" w:eastAsia="Arial" w:hAnsi="Arial"/>
-          <w:sz w:val="24"/>
-          <w:szCs w:val="24"/>
-          <w:u w:val="none"/>
-          <w:shd w:fill="b6d7a8" w:val="clear"/>
-        </w:rPr>
-      </w:pPr>
-      <w:r>
-        <w:rPr>
-          <w:rFonts w:ascii="Arial" w:cs="Arial" w:eastAsia="Arial" w:hAnsi="Arial"/>
-          <w:sz w:val="24"/>
-          <w:szCs w:val="24"/>
-          <w:shd w:fill="b6d7a8" w:val="clear"/>
-          <w:rtl w:val="0"/>
-        </w:rPr>
-        <w:t xml:space="preserve">fonte de dados (utilizamos os dados abertos do dataSus), ou seja não precisamos nos preocupar com custos os dados já estão disponíveis;</w:t>
-      </w:r>
-    </w:p>
-    <w:p>
-      <w:pPr>
-        <w:numPr>
-          <w:ilvl w:val="0"/>
-          <w:numId w:val="15"/>
-        </w:numPr>
-        <w:ind w:left="720" w:hanging="360"/>
-        <w:jc w:val="both"/>
-        <w:rPr>
-          <w:rFonts w:ascii="Arial" w:cs="Arial" w:eastAsia="Arial" w:hAnsi="Arial"/>
-          <w:sz w:val="24"/>
-          <w:szCs w:val="24"/>
-          <w:u w:val="none"/>
-          <w:shd w:fill="b6d7a8" w:val="clear"/>
-        </w:rPr>
-      </w:pPr>
-      <w:r>
-        <w:rPr>
-          <w:rFonts w:ascii="Arial" w:cs="Arial" w:eastAsia="Arial" w:hAnsi="Arial"/>
-          <w:sz w:val="24"/>
-          <w:szCs w:val="24"/>
-          <w:shd w:fill="b6d7a8" w:val="clear"/>
-          <w:rtl w:val="0"/>
-        </w:rPr>
-        <w:t xml:space="preserve">base historia SRAG 2021 a 2024;</w:t>
-      </w:r>
-    </w:p>
-    <w:p>
-      <w:pPr>
-        <w:ind w:left="0" w:firstLine="0"/>
-        <w:rPr>
-          <w:rFonts w:ascii="Arial" w:cs="Arial" w:eastAsia="Arial" w:hAnsi="Arial"/>
-          <w:b w:val="1"/>
-          <w:sz w:val="24"/>
-          <w:szCs w:val="24"/>
-        </w:rPr>
-      </w:pPr>
-      <w:r>
-        <w:rPr>
-          <w:rtl w:val="0"/>
-        </w:rPr>
-      </w:r>
-    </w:p>
-    <w:p>
-      <w:pPr>
-        <w:ind w:left="0" w:firstLine="0"/>
-        <w:rPr>
-          <w:rFonts w:ascii="Arial" w:cs="Arial" w:eastAsia="Arial" w:hAnsi="Arial"/>
-          <w:b w:val="1"/>
-          <w:sz w:val="24"/>
-          <w:szCs w:val="24"/>
-        </w:rPr>
-      </w:pPr>
-      <w:r>
-        <w:rPr>
-          <w:rFonts w:ascii="Arial" w:cs="Arial" w:eastAsia="Arial" w:hAnsi="Arial"/>
-          <w:b w:val="1"/>
-          <w:sz w:val="24"/>
-          <w:szCs w:val="24"/>
-          <w:rtl w:val="0"/>
-        </w:rPr>
-        <w:t xml:space="preserve">5.1 Tipo de Pesquisa</w:t>
-      </w:r>
-    </w:p>
-    <w:p>
-      <w:pPr>
-        <w:spacing w:after="240" w:before="240" w:lineRule="auto"/>
-        <w:jc w:val="both"/>
-        <w:rPr>
-          <w:rFonts w:ascii="Arial" w:cs="Arial" w:eastAsia="Arial" w:hAnsi="Arial"/>
-          <w:sz w:val="24"/>
-          <w:szCs w:val="24"/>
-        </w:rPr>
-      </w:pPr>
-      <w:r>
-        <w:rPr>
-          <w:rFonts w:ascii="Arial" w:cs="Arial" w:eastAsia="Arial" w:hAnsi="Arial"/>
-          <w:sz w:val="24"/>
-          <w:szCs w:val="24"/>
-          <w:rtl w:val="0"/>
-        </w:rPr>
-        <w:t xml:space="preserve">Este estudo caracteriza-se como uma pesquisa aplicada, com abordagem quantitativa e exploratória. A pesquisa aplicada visa gerar conhecimento para aplicação prática na área da saúde, enquanto a abordagem quantitativa permite a análise estatística dos dados disponíveis. O caráter exploratório justifica-se pela necessidade de investigar padrões nos dados de SRAG e avaliar a eficácia de diferentes modelos preditivos (Sena, 2021).</w:t>
-      </w:r>
-    </w:p>
-    <w:p>
-      <w:pPr>
-        <w:ind w:left="0" w:firstLine="0"/>
-        <w:jc w:val="both"/>
-        <w:rPr>
-          <w:rFonts w:ascii="Arial" w:cs="Arial" w:eastAsia="Arial" w:hAnsi="Arial"/>
-          <w:b w:val="1"/>
-          <w:sz w:val="24"/>
-          <w:szCs w:val="24"/>
-        </w:rPr>
-      </w:pPr>
-      <w:r>
-        <w:rPr>
-          <w:rFonts w:ascii="Arial" w:cs="Arial" w:eastAsia="Arial" w:hAnsi="Arial"/>
-          <w:b w:val="1"/>
-          <w:sz w:val="24"/>
-          <w:szCs w:val="24"/>
-          <w:rtl w:val="0"/>
-        </w:rPr>
-        <w:t xml:space="preserve">5.2 Objetivo da Pesquisa</w:t>
-      </w:r>
-    </w:p>
-    <w:p>
-      <w:pPr>
-        <w:spacing w:after="240" w:before="240" w:lineRule="auto"/>
-        <w:jc w:val="both"/>
-        <w:rPr>
-          <w:rFonts w:ascii="Arial" w:cs="Arial" w:eastAsia="Arial" w:hAnsi="Arial"/>
-          <w:sz w:val="24"/>
-          <w:szCs w:val="24"/>
-        </w:rPr>
-      </w:pPr>
-      <w:r>
-        <w:rPr>
-          <w:rFonts w:ascii="Arial" w:cs="Arial" w:eastAsia="Arial" w:hAnsi="Arial"/>
-          <w:sz w:val="24"/>
-          <w:szCs w:val="24"/>
-          <w:rtl w:val="0"/>
-        </w:rPr>
-        <w:t xml:space="preserve">O objetivo deste estudo é desenvolver um modelo preditivo para análise de desfechos clínicos em pacientes diagnosticados com SRAG, utilizando técnicas de aprendizado de máquina e dados disponíveis no DataSUS. Pretende-se identificar quais variáveis influenciam os desfechos clínicos e comparar diferentes algoritmos para determinar qual apresenta melhor desempenho na predição (Silva e Silva Neto, 2022).</w:t>
-      </w:r>
-    </w:p>
-    <w:p>
-      <w:pPr>
-        <w:ind w:left="0" w:firstLine="0"/>
-        <w:rPr>
-          <w:rFonts w:ascii="Arial" w:cs="Arial" w:eastAsia="Arial" w:hAnsi="Arial"/>
-          <w:b w:val="1"/>
-          <w:sz w:val="24"/>
-          <w:szCs w:val="24"/>
-        </w:rPr>
-      </w:pPr>
-      <w:r>
-        <w:rPr>
-          <w:rtl w:val="0"/>
-        </w:rPr>
-      </w:r>
-    </w:p>
-    <w:p>
-      <w:pPr>
-        <w:ind w:left="0" w:firstLine="0"/>
-        <w:rPr>
-          <w:rFonts w:ascii="Arial" w:cs="Arial" w:eastAsia="Arial" w:hAnsi="Arial"/>
-          <w:b w:val="1"/>
-          <w:sz w:val="24"/>
-          <w:szCs w:val="24"/>
-        </w:rPr>
-      </w:pPr>
-      <w:r>
-        <w:rPr>
-          <w:rFonts w:ascii="Arial" w:cs="Arial" w:eastAsia="Arial" w:hAnsi="Arial"/>
-          <w:b w:val="1"/>
-          <w:sz w:val="24"/>
-          <w:szCs w:val="24"/>
-          <w:rtl w:val="0"/>
-        </w:rPr>
-        <w:t xml:space="preserve">5.3 Fonte de Dados</w:t>
-      </w:r>
-    </w:p>
-    <w:p>
-      <w:pPr>
-        <w:spacing w:after="240" w:before="240" w:lineRule="auto"/>
-        <w:jc w:val="both"/>
-        <w:rPr>
-          <w:rFonts w:ascii="Arial" w:cs="Arial" w:eastAsia="Arial" w:hAnsi="Arial"/>
-          <w:sz w:val="24"/>
-          <w:szCs w:val="24"/>
-        </w:rPr>
-      </w:pPr>
-      <w:r>
-        <w:rPr>
-          <w:rFonts w:ascii="Arial" w:cs="Arial" w:eastAsia="Arial" w:hAnsi="Arial"/>
-          <w:sz w:val="24"/>
-          <w:szCs w:val="24"/>
-          <w:rtl w:val="0"/>
-        </w:rPr>
-        <w:t xml:space="preserve">Os dados utilizados neste estudo serão extraídos do banco de dados do DataSUS, que disponibiliza informações de saúde pública no Brasil. O conjunto de dados contém registros de pacientes diagnosticados com SRAG, incluindo variáveis demográficas, clínicas e epidemiológicas. Serão consideradas variáveis como idade, sexo, presença de comorbidades, uso de ventilação mecânica, internação em UTI e status vacinal contra COVID-19 e Influenza (Júnior, 2024).</w:t>
-      </w:r>
-    </w:p>
-    <w:p>
-      <w:pPr>
-        <w:ind w:left="0" w:firstLine="0"/>
-        <w:rPr>
-          <w:rFonts w:ascii="Arial" w:cs="Arial" w:eastAsia="Arial" w:hAnsi="Arial"/>
-          <w:b w:val="1"/>
-          <w:sz w:val="24"/>
-          <w:szCs w:val="24"/>
-        </w:rPr>
-      </w:pPr>
-      <w:r>
-        <w:rPr>
-          <w:rtl w:val="0"/>
-        </w:rPr>
-      </w:r>
-    </w:p>
-    <w:p>
-      <w:pPr>
-        <w:ind w:left="0" w:firstLine="0"/>
-        <w:rPr>
-          <w:rFonts w:ascii="Arial" w:cs="Arial" w:eastAsia="Arial" w:hAnsi="Arial"/>
-          <w:b w:val="1"/>
-          <w:sz w:val="24"/>
-          <w:szCs w:val="24"/>
-        </w:rPr>
-      </w:pPr>
-      <w:r>
-        <w:rPr>
-          <w:rFonts w:ascii="Arial" w:cs="Arial" w:eastAsia="Arial" w:hAnsi="Arial"/>
-          <w:b w:val="1"/>
-          <w:sz w:val="24"/>
-          <w:szCs w:val="24"/>
-          <w:rtl w:val="0"/>
-        </w:rPr>
-        <w:t xml:space="preserve">5.4 Amostra</w:t>
-      </w:r>
-    </w:p>
-    <w:p>
-      <w:pPr>
-        <w:spacing w:after="240" w:before="240" w:lineRule="auto"/>
-        <w:rPr>
-          <w:rFonts w:ascii="Arial" w:cs="Arial" w:eastAsia="Arial" w:hAnsi="Arial"/>
-          <w:sz w:val="24"/>
-          <w:szCs w:val="24"/>
-        </w:rPr>
-      </w:pPr>
-      <w:r>
-        <w:rPr>
-          <w:rFonts w:ascii="Arial" w:cs="Arial" w:eastAsia="Arial" w:hAnsi="Arial"/>
-          <w:sz w:val="24"/>
-          <w:szCs w:val="24"/>
-          <w:rtl w:val="0"/>
-        </w:rPr>
-        <w:t xml:space="preserve">A amostra será composta por registros de pacientes diagnosticados com SRAG no ano de 2024, totalizando aproximadamente 26.000 registros. Os critérios de inclusão consideram apenas pacientes com diagnóstico confirmado, enquanto registros incompletos ou inconsistentes serão excluídos ou tratados durante a fase de pré-processamento (Belini, Ataide e Lochter, 2024).</w:t>
-      </w:r>
-    </w:p>
-    <w:p>
-      <w:pPr>
-        <w:ind w:left="0" w:firstLine="0"/>
-        <w:rPr>
-          <w:rFonts w:ascii="Arial" w:cs="Arial" w:eastAsia="Arial" w:hAnsi="Arial"/>
-          <w:b w:val="1"/>
-          <w:sz w:val="24"/>
-          <w:szCs w:val="24"/>
-        </w:rPr>
-      </w:pPr>
-      <w:r>
-        <w:rPr>
-          <w:rtl w:val="0"/>
-        </w:rPr>
-      </w:r>
-    </w:p>
-    <w:p>
-      <w:pPr>
-        <w:ind w:left="0" w:firstLine="0"/>
-        <w:rPr>
-          <w:rFonts w:ascii="Arial" w:cs="Arial" w:eastAsia="Arial" w:hAnsi="Arial"/>
-          <w:b w:val="1"/>
-          <w:sz w:val="24"/>
-          <w:szCs w:val="24"/>
-        </w:rPr>
-      </w:pPr>
-      <w:r>
-        <w:rPr>
-          <w:rFonts w:ascii="Arial" w:cs="Arial" w:eastAsia="Arial" w:hAnsi="Arial"/>
-          <w:b w:val="1"/>
-          <w:sz w:val="24"/>
-          <w:szCs w:val="24"/>
-          <w:rtl w:val="0"/>
-        </w:rPr>
-        <w:t xml:space="preserve">5.5 Pré-processamento de Dados</w:t>
-      </w:r>
-    </w:p>
-    <w:p>
-      <w:pPr>
-        <w:spacing w:after="240" w:before="240" w:lineRule="auto"/>
-        <w:rPr>
-          <w:rFonts w:ascii="Arial" w:cs="Arial" w:eastAsia="Arial" w:hAnsi="Arial"/>
-          <w:sz w:val="24"/>
-          <w:szCs w:val="24"/>
-        </w:rPr>
-      </w:pPr>
-      <w:r>
-        <w:rPr>
-          <w:rFonts w:ascii="Arial" w:cs="Arial" w:eastAsia="Arial" w:hAnsi="Arial"/>
-          <w:sz w:val="24"/>
-          <w:szCs w:val="24"/>
-          <w:rtl w:val="0"/>
-        </w:rPr>
-        <w:t xml:space="preserve">O pré-processamento dos dados será realizado em etapas essenciais para garantir a qualidade e a usabilidade do conjunto de dados. As principais etapas incluem:</w:t>
-      </w:r>
-    </w:p>
-    <w:p>
-      <w:pPr>
-        <w:numPr>
-          <w:ilvl w:val="0"/>
-          <w:numId w:val="17"/>
+          <w:numId w:val="16"/>
         </w:numPr>
         <w:spacing w:after="0" w:afterAutospacing="0" w:before="240" w:lineRule="auto"/>
         <w:ind w:left="720" w:hanging="360"/>
         <w:rPr>
           <w:rFonts w:ascii="Arial" w:cs="Arial" w:eastAsia="Arial" w:hAnsi="Arial"/>
-          <w:sz w:val="24"/>
-          <w:szCs w:val="24"/>
-        </w:rPr>
-      </w:pPr>
-      <w:r>
-        <w:rPr>
-          <w:rFonts w:ascii="Arial" w:cs="Arial" w:eastAsia="Arial" w:hAnsi="Arial"/>
+          <w:b w:val="1"/>
+          <w:sz w:val="24"/>
+          <w:szCs w:val="24"/>
+        </w:rPr>
+      </w:pPr>
+      <w:sdt>
+        <w:sdtPr>
+          <w:tag w:val="goog_rdk_107"/>
+        </w:sdtPr>
+        <w:sdtContent>
+          <w:commentRangeStart w:id="82"/>
+        </w:sdtContent>
+      </w:sdt>
+      <w:r>
+        <w:rPr>
+          <w:rFonts w:ascii="Arial" w:cs="Arial" w:eastAsia="Arial" w:hAnsi="Arial"/>
+          <w:b w:val="1"/>
           <w:sz w:val="24"/>
           <w:szCs w:val="24"/>
           <w:rtl w:val="0"/>
@@ -8275,19 +8694,21 @@
       <w:pPr>
         <w:numPr>
           <w:ilvl w:val="0"/>
-          <w:numId w:val="17"/>
+          <w:numId w:val="16"/>
         </w:numPr>
         <w:spacing w:after="0" w:afterAutospacing="0" w:before="0" w:beforeAutospacing="0" w:lineRule="auto"/>
         <w:ind w:left="720" w:hanging="360"/>
         <w:rPr>
           <w:rFonts w:ascii="Arial" w:cs="Arial" w:eastAsia="Arial" w:hAnsi="Arial"/>
-          <w:sz w:val="24"/>
-          <w:szCs w:val="24"/>
-        </w:rPr>
-      </w:pPr>
-      <w:r>
-        <w:rPr>
-          <w:rFonts w:ascii="Arial" w:cs="Arial" w:eastAsia="Arial" w:hAnsi="Arial"/>
+          <w:b w:val="1"/>
+          <w:sz w:val="24"/>
+          <w:szCs w:val="24"/>
+        </w:rPr>
+      </w:pPr>
+      <w:r>
+        <w:rPr>
+          <w:rFonts w:ascii="Arial" w:cs="Arial" w:eastAsia="Arial" w:hAnsi="Arial"/>
+          <w:b w:val="1"/>
           <w:sz w:val="24"/>
           <w:szCs w:val="24"/>
           <w:rtl w:val="0"/>
@@ -8299,7 +8720,7 @@
       <w:pPr>
         <w:numPr>
           <w:ilvl w:val="0"/>
-          <w:numId w:val="17"/>
+          <w:numId w:val="16"/>
         </w:numPr>
         <w:spacing w:after="240" w:before="0" w:beforeAutospacing="0" w:lineRule="auto"/>
         <w:ind w:left="720" w:hanging="360"/>
@@ -8312,11 +8733,25 @@
       <w:r>
         <w:rPr>
           <w:rFonts w:ascii="Arial" w:cs="Arial" w:eastAsia="Arial" w:hAnsi="Arial"/>
-          <w:sz w:val="24"/>
-          <w:szCs w:val="24"/>
-          <w:rtl w:val="0"/>
-        </w:rPr>
-        <w:t xml:space="preserve">Balanceamento de classes: Uso de técnicas como oversampling e undersampling para equilibrar a distribuição das classes e evitar viés no treinamento do modelo (Barreto, 2021).</w:t>
+          <w:b w:val="1"/>
+          <w:sz w:val="24"/>
+          <w:szCs w:val="24"/>
+          <w:rtl w:val="0"/>
+        </w:rPr>
+        <w:t xml:space="preserve">Balanceamento de classes: Uso de técnicas como oversampling e undersampling para equilibrar a distribuição das classes e evitar viés no treinamento do modelo (Barreto, 2021</w:t>
+      </w:r>
+      <w:commentRangeEnd w:id="82"/>
+      <w:r>
+        <w:commentReference w:id="82"/>
+      </w:r>
+      <w:r>
+        <w:rPr>
+          <w:rFonts w:ascii="Arial" w:cs="Arial" w:eastAsia="Arial" w:hAnsi="Arial"/>
+          <w:sz w:val="24"/>
+          <w:szCs w:val="24"/>
+          <w:rtl w:val="0"/>
+        </w:rPr>
+        <w:t xml:space="preserve">).</w:t>
       </w:r>
     </w:p>
     <w:p>
@@ -8372,7 +8807,26 @@
           <w:szCs w:val="24"/>
           <w:rtl w:val="0"/>
         </w:rPr>
-        <w:t xml:space="preserve">Para a implementação do modelo preditivo, serão utilizadas diversas ferramentas computacionais que auxiliam na manipulação, visualização e análise dos dados.</w:t>
+        <w:t xml:space="preserve">Para a implementação do modelo </w:t>
+      </w:r>
+      <w:r>
+        <w:rPr>
+          <w:rFonts w:ascii="Arial" w:cs="Arial" w:eastAsia="Arial" w:hAnsi="Arial"/>
+          <w:b w:val="1"/>
+          <w:sz w:val="24"/>
+          <w:szCs w:val="24"/>
+          <w:rtl w:val="0"/>
+        </w:rPr>
+        <w:t xml:space="preserve">preditivo</w:t>
+      </w:r>
+      <w:r>
+        <w:rPr>
+          <w:rFonts w:ascii="Arial" w:cs="Arial" w:eastAsia="Arial" w:hAnsi="Arial"/>
+          <w:sz w:val="24"/>
+          <w:szCs w:val="24"/>
+          <w:rtl w:val="0"/>
+        </w:rPr>
+        <w:t xml:space="preserve">, serão utilizadas diversas ferramentas computacionais que auxiliam na visualização, manipulação e análise dos dados.</w:t>
       </w:r>
     </w:p>
     <w:p>
@@ -8771,7 +9225,7 @@
       <w:pPr>
         <w:numPr>
           <w:ilvl w:val="0"/>
-          <w:numId w:val="18"/>
+          <w:numId w:val="17"/>
         </w:numPr>
         <w:ind w:left="720" w:hanging="360"/>
         <w:rPr>
@@ -8784,10 +9238,10 @@
       </w:pPr>
       <w:sdt>
         <w:sdtPr>
-          <w:tag w:val="goog_rdk_92"/>
+          <w:tag w:val="goog_rdk_108"/>
         </w:sdtPr>
         <w:sdtContent>
-          <w:commentRangeStart w:id="74"/>
+          <w:commentRangeStart w:id="83"/>
         </w:sdtContent>
       </w:sdt>
       <w:r>
@@ -8834,9 +9288,9 @@
           <w:t xml:space="preserve">https://colab.research.google.com/drive/1tg1hKxFYfgRVxRXTjPllKwhKSm_goi8P?usp=sharing</w:t>
         </w:r>
       </w:hyperlink>
-      <w:commentRangeEnd w:id="74"/>
-      <w:r>
-        <w:commentReference w:id="74"/>
+      <w:commentRangeEnd w:id="83"/>
+      <w:r>
+        <w:commentReference w:id="83"/>
       </w:r>
       <w:r>
         <w:rPr>
@@ -12146,10 +12600,10 @@
       </w:pPr>
       <w:sdt>
         <w:sdtPr>
-          <w:tag w:val="goog_rdk_93"/>
+          <w:tag w:val="goog_rdk_109"/>
         </w:sdtPr>
         <w:sdtContent>
-          <w:commentRangeStart w:id="75"/>
+          <w:commentRangeStart w:id="84"/>
         </w:sdtContent>
       </w:sdt>
       <w:r>
@@ -12171,9 +12625,9 @@
         </w:rPr>
         <w:t xml:space="preserve"> Mineração de dados na base de dados de SRAG. 2024. Trabalho de Conclusão de Curso (Bacharelado em Engenharia da Computação) – Universidade Federal do Espírito Santo, São Mateus, 2024.</w:t>
       </w:r>
-      <w:commentRangeEnd w:id="75"/>
-      <w:r>
-        <w:commentReference w:id="75"/>
+      <w:commentRangeEnd w:id="84"/>
+      <w:r>
+        <w:commentReference w:id="84"/>
       </w:r>
       <w:r>
         <w:rPr>
@@ -12615,10 +13069,10 @@
       </w:pPr>
       <w:sdt>
         <w:sdtPr>
-          <w:tag w:val="goog_rdk_94"/>
+          <w:tag w:val="goog_rdk_110"/>
         </w:sdtPr>
         <w:sdtContent>
-          <w:commentRangeStart w:id="76"/>
+          <w:commentRangeStart w:id="85"/>
         </w:sdtContent>
       </w:sdt>
       <w:r>
@@ -12630,9 +13084,9 @@
         </w:rPr>
         <w:t xml:space="preserve">Altino, Rita de Cássia et al. A importância da notificação compulsória frente à Síndrome Respiratória Aguda Grave (SRAG) e Covid-19. Rev. Salusvita (Online), p. 627-649, 2020. </w:t>
       </w:r>
-      <w:commentRangeEnd w:id="76"/>
-      <w:r>
-        <w:commentReference w:id="76"/>
+      <w:commentRangeEnd w:id="85"/>
+      <w:r>
+        <w:commentReference w:id="85"/>
       </w:r>
       <w:r>
         <w:rPr>
@@ -15925,7 +16379,7 @@
 
 <file path=word/comments.xml><?xml version="1.0" encoding="utf-8"?>
 <w:comments xmlns:mc="http://schemas.openxmlformats.org/markup-compatibility/2006" xmlns:o="urn:schemas-microsoft-com:office:office" xmlns:r="http://schemas.openxmlformats.org/officeDocument/2006/relationships" xmlns:m="http://schemas.openxmlformats.org/officeDocument/2006/math" xmlns:v="urn:schemas-microsoft-com:vml" xmlns:wp="http://schemas.openxmlformats.org/drawingml/2006/wordprocessingDrawing" xmlns:w10="urn:schemas-microsoft-com:office:word" xmlns:w="http://schemas.openxmlformats.org/wordprocessingml/2006/main" xmlns:wne="http://schemas.microsoft.com/office/word/2006/wordml" xmlns:sl="http://schemas.openxmlformats.org/schemaLibrary/2006/main" xmlns:a="http://schemas.openxmlformats.org/drawingml/2006/main" xmlns:pic="http://schemas.openxmlformats.org/drawingml/2006/picture" xmlns:c="http://schemas.openxmlformats.org/drawingml/2006/chart" xmlns:lc="http://schemas.openxmlformats.org/drawingml/2006/lockedCanvas" xmlns:dgm="http://schemas.openxmlformats.org/drawingml/2006/diagram" xmlns:wps="http://schemas.microsoft.com/office/word/2010/wordprocessingShape" xmlns:wpg="http://schemas.microsoft.com/office/word/2010/wordprocessingGroup" xmlns:w14="http://schemas.microsoft.com/office/word/2010/wordml" xmlns:w15="http://schemas.microsoft.com/office/word/2012/wordml" xmlns:w16="http://schemas.microsoft.com/office/word/2018/wordml" xmlns:w16cex="http://schemas.microsoft.com/office/word/2018/wordml/cex" xmlns:w16cid="http://schemas.microsoft.com/office/word/2016/wordml/cid" xmlns="http://schemas.microsoft.com/office/tasks/2019/documenttasks" xmlns:cr="http://schemas.microsoft.com/office/comments/2020/reactions">
-  <w:comment w:author="Iasmin Marques" w:id="0" w:date="2025-02-17T18:33:10Z">
+  <w:comment w:author="Iasmin Marques" w:id="80" w:date="2025-03-08T01:29:53Z">
     <w:p>
       <w:pPr>
         <w:keepNext w:val="0"/>
@@ -15972,11 +16426,11 @@
           <w:vertAlign w:val="baseline"/>
           <w:rtl w:val="0"/>
         </w:rPr>
-        <w:t xml:space="preserve">falar sobre o significado de cada</w:t>
+        <w:t xml:space="preserve">Verificar se vai ser o banco de dados todo … pq é muito</w:t>
       </w:r>
     </w:p>
   </w:comment>
-  <w:comment w:author="Iasmin Marques" w:id="69" w:date="2025-03-06T20:26:41Z">
+  <w:comment w:author="Iasmin Marques" w:id="81" w:date="2025-03-08T01:33:08Z">
     <w:p>
       <w:pPr>
         <w:keepNext w:val="0"/>
@@ -16023,11 +16477,11 @@
           <w:vertAlign w:val="baseline"/>
           <w:rtl w:val="0"/>
         </w:rPr>
-        <w:t xml:space="preserve">pagina 50 - artigo 6</w:t>
+        <w:t xml:space="preserve">Verificar ( se só serão inclusos mesmo os registros )</w:t>
       </w:r>
     </w:p>
   </w:comment>
-  <w:comment w:author="Iasmin Marques" w:id="61" w:date="2025-03-06T19:56:29Z">
+  <w:comment w:author="Iasmin Marques" w:id="65" w:date="2025-03-06T19:56:29Z">
     <w:p>
       <w:pPr>
         <w:keepNext w:val="0"/>
@@ -16078,7 +16532,7 @@
       </w:r>
     </w:p>
   </w:comment>
-  <w:comment w:author="Iasmin Marques" w:id="59" w:date="2025-03-06T19:57:01Z">
+  <w:comment w:author="Iasmin Marques" w:id="63" w:date="2025-03-06T19:57:01Z">
     <w:p>
       <w:pPr>
         <w:keepNext w:val="0"/>
@@ -16129,7 +16583,7 @@
       </w:r>
     </w:p>
   </w:comment>
-  <w:comment w:author="Iasmin Marques" w:id="14" w:date="2025-03-03T14:26:00Z">
+  <w:comment w:author="Iasmin Marques" w:id="9" w:date="2025-03-03T13:58:28Z">
     <w:p>
       <w:pPr>
         <w:keepNext w:val="0"/>
@@ -16176,11 +16630,11 @@
           <w:vertAlign w:val="baseline"/>
           <w:rtl w:val="0"/>
         </w:rPr>
-        <w:t xml:space="preserve">paginas 21 e 110 - artigo_2</w:t>
+        <w:t xml:space="preserve">pagina 1 - artigo 4</w:t>
       </w:r>
     </w:p>
   </w:comment>
-  <w:comment w:author="Iasmin Marques" w:id="9" w:date="2025-03-03T13:58:28Z">
+  <w:comment w:author="Iasmin Marques" w:id="78" w:date="2025-03-08T01:13:06Z">
     <w:p>
       <w:pPr>
         <w:keepNext w:val="0"/>
@@ -16227,11 +16681,11 @@
           <w:vertAlign w:val="baseline"/>
           <w:rtl w:val="0"/>
         </w:rPr>
-        <w:t xml:space="preserve">pagina 1 - artigo 4</w:t>
+        <w:t xml:space="preserve">Explicar o q é</w:t>
       </w:r>
     </w:p>
   </w:comment>
-  <w:comment w:author="Iasmin Marques" w:id="44" w:date="2025-03-07T19:25:44Z">
+  <w:comment w:author="Iasmin Marques" w:id="82" w:date="2025-03-08T01:40:01Z">
     <w:p>
       <w:pPr>
         <w:keepNext w:val="0"/>
@@ -16278,11 +16732,11 @@
           <w:vertAlign w:val="baseline"/>
           <w:rtl w:val="0"/>
         </w:rPr>
-        <w:t xml:space="preserve">alterar imagem para texto</w:t>
+        <w:t xml:space="preserve">Verificar se dá pra aproveitar alguma coisa</w:t>
       </w:r>
     </w:p>
   </w:comment>
-  <w:comment w:author="Iasmin Marques" w:id="76" w:date="2025-03-05T00:44:22Z">
+  <w:comment w:author="Iasmin Marques" w:id="56" w:date="2025-03-08T00:44:50Z">
     <w:p>
       <w:pPr>
         <w:keepNext w:val="0"/>
@@ -16329,11 +16783,11 @@
           <w:vertAlign w:val="baseline"/>
           <w:rtl w:val="0"/>
         </w:rPr>
-        <w:t xml:space="preserve">referencia utilizada no artigo 4 (citação utilizada no referencial teorico 3.1)</w:t>
+        <w:t xml:space="preserve">Verificar</w:t>
       </w:r>
     </w:p>
   </w:comment>
-  <w:comment w:author="Iasmin Marques" w:id="73" w:date="2025-02-24T17:15:37Z">
+  <w:comment w:author="Iasmin Marques" w:id="48" w:date="2025-03-08T00:31:26Z">
     <w:p>
       <w:pPr>
         <w:keepNext w:val="0"/>
@@ -16380,11 +16834,11 @@
           <w:vertAlign w:val="baseline"/>
           <w:rtl w:val="0"/>
         </w:rPr>
-        <w:t xml:space="preserve">no TCC 2 - vai falar do KDD;</w:t>
+        <w:t xml:space="preserve">Explicar o que é - nota rodapé</w:t>
       </w:r>
     </w:p>
   </w:comment>
-  <w:comment w:author="Iasmin Marques" w:id="66" w:date="2025-03-06T20:16:42Z">
+  <w:comment w:author="Iasmin Marques" w:id="25" w:date="2025-03-07T17:17:30Z">
     <w:p>
       <w:pPr>
         <w:keepNext w:val="0"/>
@@ -16431,11 +16885,11 @@
           <w:vertAlign w:val="baseline"/>
           <w:rtl w:val="0"/>
         </w:rPr>
-        <w:t xml:space="preserve">p. 1 - artigo_4</w:t>
+        <w:t xml:space="preserve">pagina 2 - artigo 4</w:t>
       </w:r>
     </w:p>
   </w:comment>
-  <w:comment w:author="Iasmin Marques" w:id="67" w:date="2025-03-06T20:16:42Z">
+  <w:comment w:author="Iasmin Marques" w:id="49" w:date="2025-03-08T00:35:23Z">
     <w:p>
       <w:pPr>
         <w:keepNext w:val="0"/>
@@ -16482,11 +16936,11 @@
           <w:vertAlign w:val="baseline"/>
           <w:rtl w:val="0"/>
         </w:rPr>
-        <w:t xml:space="preserve">p. 1 - artigo_4</w:t>
+        <w:t xml:space="preserve">Talvez retirar</w:t>
       </w:r>
     </w:p>
   </w:comment>
-  <w:comment w:author="Iasmin Marques" w:id="47" w:date="2025-03-06T19:30:24Z">
+  <w:comment w:author="Iasmin Marques" w:id="21" w:date="2025-03-06T18:43:34Z">
     <w:p>
       <w:pPr>
         <w:keepNext w:val="0"/>
@@ -16533,11 +16987,11 @@
           <w:vertAlign w:val="baseline"/>
           <w:rtl w:val="0"/>
         </w:rPr>
-        <w:t xml:space="preserve">pagina 53 - dissertacao_uallaci</w:t>
+        <w:t xml:space="preserve">add rodape?</w:t>
       </w:r>
     </w:p>
   </w:comment>
-  <w:comment w:author="Iasmin Marques" w:id="74" w:date="2025-03-05T02:45:07Z">
+  <w:comment w:author="Iasmin Marques" w:id="32" w:date="2025-03-06T18:43:34Z">
     <w:p>
       <w:pPr>
         <w:keepNext w:val="0"/>
@@ -16584,11 +17038,11 @@
           <w:vertAlign w:val="baseline"/>
           <w:rtl w:val="0"/>
         </w:rPr>
-        <w:t xml:space="preserve">verificar se vai mostrar já essa parte</w:t>
+        <w:t xml:space="preserve">add rodape?</w:t>
       </w:r>
     </w:p>
   </w:comment>
-  <w:comment w:author="Iasmin Marques" w:id="7" w:date="2025-03-03T13:34:01Z">
+  <w:comment w:author="Iasmin Marques" w:id="37" w:date="2025-03-05T01:07:56Z">
     <w:p>
       <w:pPr>
         <w:keepNext w:val="0"/>
@@ -16635,11 +17089,11 @@
           <w:vertAlign w:val="baseline"/>
           <w:rtl w:val="0"/>
         </w:rPr>
-        <w:t xml:space="preserve">pagina 21 - artigo 2</w:t>
+        <w:t xml:space="preserve">pagina 28 - disssertacao uallaci</w:t>
       </w:r>
     </w:p>
   </w:comment>
-  <w:comment w:author="Iasmin Marques" w:id="58" w:date="2025-03-05T02:22:01Z">
+  <w:comment w:author="Iasmin Marques" w:id="18" w:date="2025-03-06T18:41:51Z">
     <w:p>
       <w:pPr>
         <w:keepNext w:val="0"/>
@@ -16686,11 +17140,11 @@
           <w:vertAlign w:val="baseline"/>
           <w:rtl w:val="0"/>
         </w:rPr>
-        <w:t xml:space="preserve">pegar no machinelearins...covid</w:t>
+        <w:t xml:space="preserve">colocar em ingles e pt</w:t>
       </w:r>
     </w:p>
   </w:comment>
-  <w:comment w:author="Iasmin Marques" w:id="68" w:date="2025-03-06T20:26:31Z">
+  <w:comment w:author="Iasmin Marques" w:id="29" w:date="2025-03-06T18:41:51Z">
     <w:p>
       <w:pPr>
         <w:keepNext w:val="0"/>
@@ -16737,11 +17191,11 @@
           <w:vertAlign w:val="baseline"/>
           <w:rtl w:val="0"/>
         </w:rPr>
-        <w:t xml:space="preserve">pagina 50 - artigo 6 (olhar bem)</w:t>
+        <w:t xml:space="preserve">colocar em ingles e pt</w:t>
       </w:r>
     </w:p>
   </w:comment>
-  <w:comment w:author="Iasmin Marques" w:id="62" w:date="2025-03-05T02:25:03Z">
+  <w:comment w:author="Iasmin Marques" w:id="57" w:date="2025-03-05T01:59:29Z">
     <w:p>
       <w:pPr>
         <w:keepNext w:val="0"/>
@@ -16788,11 +17242,11 @@
           <w:vertAlign w:val="baseline"/>
           <w:rtl w:val="0"/>
         </w:rPr>
-        <w:t xml:space="preserve">pagina 120, 121 - artigo 7</w:t>
+        <w:t xml:space="preserve">pagina 120 - artigo 7</w:t>
       </w:r>
     </w:p>
   </w:comment>
-  <w:comment w:author="Iasmin Marques" w:id="25" w:date="2025-03-07T17:17:30Z">
+  <w:comment w:author="Iasmin Marques" w:id="46" w:date="2025-03-07T19:29:54Z">
     <w:p>
       <w:pPr>
         <w:keepNext w:val="0"/>
@@ -16839,11 +17293,11 @@
           <w:vertAlign w:val="baseline"/>
           <w:rtl w:val="0"/>
         </w:rPr>
-        <w:t xml:space="preserve">pagina 2 - artigo 4</w:t>
+        <w:t xml:space="preserve">VERIFICAR PLAGIO E IA</w:t>
       </w:r>
     </w:p>
   </w:comment>
-  <w:comment w:author="Iasmin Marques" w:id="26" w:date="2025-03-05T00:39:26Z">
+  <w:comment w:author="Iasmin Marques" w:id="38" w:date="2025-03-07T18:32:08Z">
     <w:p>
       <w:pPr>
         <w:keepNext w:val="0"/>
@@ -16890,11 +17344,11 @@
           <w:vertAlign w:val="baseline"/>
           <w:rtl w:val="0"/>
         </w:rPr>
-        <w:t xml:space="preserve">pagina 11 - dissertacao uallaci</w:t>
+        <w:t xml:space="preserve">citação direta do site do opendatasus</w:t>
       </w:r>
     </w:p>
   </w:comment>
-  <w:comment w:author="Iasmin Marques" w:id="6" w:date="2025-03-03T13:34:29Z">
+  <w:comment w:author="Iasmin Marques" w:id="19" w:date="2025-03-03T15:42:48Z">
     <w:p>
       <w:pPr>
         <w:keepNext w:val="0"/>
@@ -16941,11 +17395,9 @@
           <w:vertAlign w:val="baseline"/>
           <w:rtl w:val="0"/>
         </w:rPr>
-        <w:t xml:space="preserve">pagina 119 - artigo 7</w:t>
-      </w:r>
-    </w:p>
-  </w:comment>
-  <w:comment w:author="Iasmin Marques" w:id="21" w:date="2025-03-06T18:43:34Z">
+        <w:t xml:space="preserve">pagina 127 - artigo_7</w:t>
+      </w:r>
+    </w:p>
     <w:p>
       <w:pPr>
         <w:keepNext w:val="0"/>
@@ -16992,11 +17444,11 @@
           <w:vertAlign w:val="baseline"/>
           <w:rtl w:val="0"/>
         </w:rPr>
-        <w:t xml:space="preserve">add rodape?</w:t>
+        <w:t xml:space="preserve">em considerações finais</w:t>
       </w:r>
     </w:p>
   </w:comment>
-  <w:comment w:author="Iasmin Marques" w:id="32" w:date="2025-03-06T18:43:34Z">
+  <w:comment w:author="Iasmin Marques" w:id="30" w:date="2025-03-03T15:42:48Z">
     <w:p>
       <w:pPr>
         <w:keepNext w:val="0"/>
@@ -17043,11 +17495,9 @@
           <w:vertAlign w:val="baseline"/>
           <w:rtl w:val="0"/>
         </w:rPr>
-        <w:t xml:space="preserve">add rodape?</w:t>
-      </w:r>
-    </w:p>
-  </w:comment>
-  <w:comment w:author="Iasmin Marques" w:id="37" w:date="2025-03-05T01:07:56Z">
+        <w:t xml:space="preserve">pagina 127 - artigo_7</w:t>
+      </w:r>
+    </w:p>
     <w:p>
       <w:pPr>
         <w:keepNext w:val="0"/>
@@ -17094,11 +17544,11 @@
           <w:vertAlign w:val="baseline"/>
           <w:rtl w:val="0"/>
         </w:rPr>
-        <w:t xml:space="preserve">pagina 28 - disssertacao uallaci</w:t>
+        <w:t xml:space="preserve">em considerações finais</w:t>
       </w:r>
     </w:p>
   </w:comment>
-  <w:comment w:author="Iasmin Marques" w:id="41" w:date="2025-03-06T19:21:47Z">
+  <w:comment w:author="Iasmin Marques" w:id="74" w:date="2025-03-05T02:30:41Z">
     <w:p>
       <w:pPr>
         <w:keepNext w:val="0"/>
@@ -17145,11 +17595,11 @@
           <w:vertAlign w:val="baseline"/>
           <w:rtl w:val="0"/>
         </w:rPr>
-        <w:t xml:space="preserve">pagina 52 - dissertacao_uallaci</w:t>
+        <w:t xml:space="preserve">verificar se eu irei deixar</w:t>
       </w:r>
     </w:p>
   </w:comment>
-  <w:comment w:author="Iasmin Marques" w:id="18" w:date="2025-03-06T18:41:51Z">
+  <w:comment w:author="Iasmin Marques" w:id="52" w:date="2025-03-06T19:10:53Z">
     <w:p>
       <w:pPr>
         <w:keepNext w:val="0"/>
@@ -17196,11 +17646,11 @@
           <w:vertAlign w:val="baseline"/>
           <w:rtl w:val="0"/>
         </w:rPr>
-        <w:t xml:space="preserve">colocar em ingles e pt</w:t>
+        <w:t xml:space="preserve">artigo 6 - pagina 25 ?</w:t>
       </w:r>
     </w:p>
   </w:comment>
-  <w:comment w:author="Iasmin Marques" w:id="29" w:date="2025-03-06T18:41:51Z">
+  <w:comment w:author="Iasmin Marques" w:id="43" w:date="2025-03-05T01:38:44Z">
     <w:p>
       <w:pPr>
         <w:keepNext w:val="0"/>
@@ -17247,11 +17697,11 @@
           <w:vertAlign w:val="baseline"/>
           <w:rtl w:val="0"/>
         </w:rPr>
-        <w:t xml:space="preserve">colocar em ingles e pt</w:t>
+        <w:t xml:space="preserve">pagina 4 - artigo 4</w:t>
       </w:r>
     </w:p>
   </w:comment>
-  <w:comment w:author="Iasmin Marques" w:id="75" w:date="2025-02-27T21:35:21Z">
+  <w:comment w:author="Iasmin Marques" w:id="54" w:date="2025-03-07T19:34:05Z">
     <w:p>
       <w:pPr>
         <w:keepNext w:val="0"/>
@@ -17298,11 +17748,11 @@
           <w:vertAlign w:val="baseline"/>
           <w:rtl w:val="0"/>
         </w:rPr>
-        <w:t xml:space="preserve">verificar se é valido</w:t>
+        <w:t xml:space="preserve">fazer um topico so pra ele</w:t>
       </w:r>
     </w:p>
   </w:comment>
-  <w:comment w:author="Iasmin Marques" w:id="5" w:date="2025-03-03T13:35:10Z">
+  <w:comment w:author="Iasmin Marques" w:id="53" w:date="2025-03-05T01:54:14Z">
     <w:p>
       <w:pPr>
         <w:keepNext w:val="0"/>
@@ -17349,11 +17799,11 @@
           <w:vertAlign w:val="baseline"/>
           <w:rtl w:val="0"/>
         </w:rPr>
-        <w:t xml:space="preserve">pagina 1725 - artigo_sus</w:t>
+        <w:t xml:space="preserve">pagina 23,21 - artigo 2</w:t>
       </w:r>
     </w:p>
   </w:comment>
-  <w:comment w:author="Iasmin Marques" w:id="54" w:date="2025-03-05T02:04:20Z">
+  <w:comment w:author="Iasmin Marques" w:id="55" w:date="2025-03-05T02:23:15Z">
     <w:p>
       <w:pPr>
         <w:keepNext w:val="0"/>
@@ -17400,11 +17850,11 @@
           <w:vertAlign w:val="baseline"/>
           <w:rtl w:val="0"/>
         </w:rPr>
-        <w:t xml:space="preserve">pagina 3 - artigo 4</w:t>
+        <w:t xml:space="preserve">adicionar formulas - exemplo artigo 7</w:t>
       </w:r>
     </w:p>
   </w:comment>
-  <w:comment w:author="Iasmin Marques" w:id="10" w:date="2025-02-24T13:18:29Z">
+  <w:comment w:author="Iasmin Marques" w:id="60" w:date="2025-03-05T02:11:12Z">
     <w:p>
       <w:pPr>
         <w:keepNext w:val="0"/>
@@ -17451,11 +17901,11 @@
           <w:vertAlign w:val="baseline"/>
           <w:rtl w:val="0"/>
         </w:rPr>
-        <w:t xml:space="preserve">add nota de rodapé</w:t>
+        <w:t xml:space="preserve">pagina 10 - machinalearnigprevisaocovid</w:t>
       </w:r>
     </w:p>
   </w:comment>
-  <w:comment w:author="Iasmin Marques" w:id="23" w:date="2025-03-07T16:56:18Z">
+  <w:comment w:author="Iasmin Marques" w:id="8" w:date="2025-03-03T13:55:47Z">
     <w:p>
       <w:pPr>
         <w:keepNext w:val="0"/>
@@ -17502,11 +17952,11 @@
           <w:vertAlign w:val="baseline"/>
           <w:rtl w:val="0"/>
         </w:rPr>
-        <w:t xml:space="preserve">Add rodapé?</w:t>
+        <w:t xml:space="preserve">pagina 19 - artigo 2</w:t>
       </w:r>
     </w:p>
   </w:comment>
-  <w:comment w:author="Iasmin Marques" w:id="53" w:date="2025-03-05T01:59:29Z">
+  <w:comment w:author="Iasmin Marques" w:id="61" w:date="2025-03-05T02:15:54Z">
     <w:p>
       <w:pPr>
         <w:keepNext w:val="0"/>
@@ -17553,11 +18003,11 @@
           <w:vertAlign w:val="baseline"/>
           <w:rtl w:val="0"/>
         </w:rPr>
-        <w:t xml:space="preserve">pagina 120 - artigo 7</w:t>
+        <w:t xml:space="preserve">PAGINA 22 e 12 - DISSERATCAO UALLaci</w:t>
       </w:r>
     </w:p>
   </w:comment>
-  <w:comment w:author="Iasmin Marques" w:id="11" w:date="2025-02-24T13:16:06Z">
+  <w:comment w:author="Iasmin Marques" w:id="69" w:date="2025-03-06T20:10:33Z">
     <w:p>
       <w:pPr>
         <w:keepNext w:val="0"/>
@@ -17604,11 +18054,11 @@
           <w:vertAlign w:val="baseline"/>
           <w:rtl w:val="0"/>
         </w:rPr>
-        <w:t xml:space="preserve">adicionar o significado no rodapé</w:t>
+        <w:t xml:space="preserve">pagina 49 - artigo 6</w:t>
       </w:r>
     </w:p>
   </w:comment>
-  <w:comment w:author="Iasmin Marques" w:id="46" w:date="2025-03-07T19:29:54Z">
+  <w:comment w:author="Iasmin Marques" w:id="22" w:date="2025-03-03T15:45:59Z">
     <w:p>
       <w:pPr>
         <w:keepNext w:val="0"/>
@@ -17655,11 +18105,9 @@
           <w:vertAlign w:val="baseline"/>
           <w:rtl w:val="0"/>
         </w:rPr>
-        <w:t xml:space="preserve">VERIFICAR PLAGIO E IA</w:t>
-      </w:r>
-    </w:p>
-  </w:comment>
-  <w:comment w:author="Iasmin Marques" w:id="38" w:date="2025-03-07T18:32:08Z">
+        <w:t xml:space="preserve">pagina 2 - artigo_4</w:t>
+      </w:r>
+    </w:p>
     <w:p>
       <w:pPr>
         <w:keepNext w:val="0"/>
@@ -17706,11 +18154,11 @@
           <w:vertAlign w:val="baseline"/>
           <w:rtl w:val="0"/>
         </w:rPr>
-        <w:t xml:space="preserve">citação direta do site do opendatasus</w:t>
+        <w:t xml:space="preserve">em trabalhos relacionados</w:t>
       </w:r>
     </w:p>
   </w:comment>
-  <w:comment w:author="Iasmin Marques" w:id="71" w:date="2025-02-19T16:32:43Z">
+  <w:comment w:author="Iasmin Marques" w:id="33" w:date="2025-03-03T15:45:59Z">
     <w:p>
       <w:pPr>
         <w:keepNext w:val="0"/>
@@ -17757,11 +18205,9 @@
           <w:vertAlign w:val="baseline"/>
           <w:rtl w:val="0"/>
         </w:rPr>
-        <w:t xml:space="preserve">verificar qual palavra e melhor</w:t>
-      </w:r>
-    </w:p>
-  </w:comment>
-  <w:comment w:author="Iasmin Marques" w:id="19" w:date="2025-03-03T15:42:48Z">
+        <w:t xml:space="preserve">pagina 2 - artigo_4</w:t>
+      </w:r>
+    </w:p>
     <w:p>
       <w:pPr>
         <w:keepNext w:val="0"/>
@@ -17808,9 +18254,11 @@
           <w:vertAlign w:val="baseline"/>
           <w:rtl w:val="0"/>
         </w:rPr>
-        <w:t xml:space="preserve">pagina 127 - artigo_7</w:t>
-      </w:r>
-    </w:p>
+        <w:t xml:space="preserve">em trabalhos relacionados</w:t>
+      </w:r>
+    </w:p>
+  </w:comment>
+  <w:comment w:author="Iasmin Marques" w:id="79" w:date="2025-03-08T01:55:57Z">
     <w:p>
       <w:pPr>
         <w:keepNext w:val="0"/>
@@ -17857,11 +18305,11 @@
           <w:vertAlign w:val="baseline"/>
           <w:rtl w:val="0"/>
         </w:rPr>
-        <w:t xml:space="preserve">em considerações finais</w:t>
+        <w:t xml:space="preserve">Verificar</w:t>
       </w:r>
     </w:p>
   </w:comment>
-  <w:comment w:author="Iasmin Marques" w:id="30" w:date="2025-03-03T15:42:48Z">
+  <w:comment w:author="Iasmin Marques" w:id="34" w:date="2025-03-07T18:20:55Z">
     <w:p>
       <w:pPr>
         <w:keepNext w:val="0"/>
@@ -17908,9 +18356,11 @@
           <w:vertAlign w:val="baseline"/>
           <w:rtl w:val="0"/>
         </w:rPr>
-        <w:t xml:space="preserve">pagina 127 - artigo_7</w:t>
-      </w:r>
-    </w:p>
+        <w:t xml:space="preserve">pagina 14 - dissetação uallaci</w:t>
+      </w:r>
+    </w:p>
+  </w:comment>
+  <w:comment w:author="Iasmin Marques" w:id="35" w:date="2025-03-07T18:21:11Z">
     <w:p>
       <w:pPr>
         <w:keepNext w:val="0"/>
@@ -17957,11 +18407,11 @@
           <w:vertAlign w:val="baseline"/>
           <w:rtl w:val="0"/>
         </w:rPr>
-        <w:t xml:space="preserve">em considerações finais</w:t>
+        <w:t xml:space="preserve">verificar se esta correta, pq é um citação de uma citação</w:t>
       </w:r>
     </w:p>
   </w:comment>
-  <w:comment w:author="Iasmin Marques" w:id="36" w:date="2025-03-05T01:13:35Z">
+  <w:comment w:author="Iasmin Marques" w:id="15" w:date="2025-03-03T14:30:31Z">
     <w:p>
       <w:pPr>
         <w:keepNext w:val="0"/>
@@ -18008,11 +18458,11 @@
           <w:vertAlign w:val="baseline"/>
           <w:rtl w:val="0"/>
         </w:rPr>
-        <w:t xml:space="preserve">pagina 2 - machinelearinigprevisaocovid</w:t>
+        <w:t xml:space="preserve">pagina 119 - artigo 7</w:t>
       </w:r>
     </w:p>
   </w:comment>
-  <w:comment w:author="Iasmin Marques" w:id="70" w:date="2025-03-05T02:30:41Z">
+  <w:comment w:author="Iasmin Marques" w:id="1" w:date="2025-02-24T14:09:16Z">
     <w:p>
       <w:pPr>
         <w:keepNext w:val="0"/>
@@ -18059,11 +18509,11 @@
           <w:vertAlign w:val="baseline"/>
           <w:rtl w:val="0"/>
         </w:rPr>
-        <w:t xml:space="preserve">verificar se eu irei deixar</w:t>
+        <w:t xml:space="preserve">verificar se a estrutura esta ok</w:t>
       </w:r>
     </w:p>
   </w:comment>
-  <w:comment w:author="Iasmin Marques" w:id="13" w:date="2025-03-03T14:12:08Z">
+  <w:comment w:author="Iasmin Marques" w:id="42" w:date="2025-03-05T01:32:51Z">
     <w:p>
       <w:pPr>
         <w:keepNext w:val="0"/>
@@ -18110,11 +18560,11 @@
           <w:vertAlign w:val="baseline"/>
           <w:rtl w:val="0"/>
         </w:rPr>
-        <w:t xml:space="preserve">pagina 28 - dissertacao uallaci</w:t>
+        <w:t xml:space="preserve">pagina 44 - artigo 2</w:t>
       </w:r>
     </w:p>
   </w:comment>
-  <w:comment w:author="Iasmin Marques" w:id="60" w:date="2025-03-06T19:48:08Z">
+  <w:comment w:author="Iasmin Marques" w:id="45" w:date="2025-03-06T19:17:43Z">
     <w:p>
       <w:pPr>
         <w:keepNext w:val="0"/>
@@ -18161,11 +18611,11 @@
           <w:vertAlign w:val="baseline"/>
           <w:rtl w:val="0"/>
         </w:rPr>
-        <w:t xml:space="preserve">pagina 17 e 18 - machinelearningprevisaocovid.pdf</w:t>
+        <w:t xml:space="preserve">talvez de uallaci (pg 51)</w:t>
       </w:r>
     </w:p>
   </w:comment>
-  <w:comment w:author="Iasmin Marques" w:id="24" w:date="2025-03-05T00:46:53Z">
+  <w:comment w:author="Iasmin Marques" w:id="2" w:date="2025-03-07T17:40:11Z">
     <w:p>
       <w:pPr>
         <w:keepNext w:val="0"/>
@@ -18212,11 +18662,11 @@
           <w:vertAlign w:val="baseline"/>
           <w:rtl w:val="0"/>
         </w:rPr>
-        <w:t xml:space="preserve">pagina 2 - artigo 4</w:t>
+        <w:t xml:space="preserve">generalizar - nao focar em saude</w:t>
       </w:r>
     </w:p>
   </w:comment>
-  <w:comment w:author="Iasmin Marques" w:id="49" w:date="2025-03-06T19:10:53Z">
+  <w:comment w:author="Iasmin Marques" w:id="0" w:date="2025-02-17T18:33:10Z">
     <w:p>
       <w:pPr>
         <w:keepNext w:val="0"/>
@@ -18263,11 +18713,11 @@
           <w:vertAlign w:val="baseline"/>
           <w:rtl w:val="0"/>
         </w:rPr>
-        <w:t xml:space="preserve">artigo 6 - pagina 25 ?</w:t>
+        <w:t xml:space="preserve">falar sobre o significado de cada</w:t>
       </w:r>
     </w:p>
   </w:comment>
-  <w:comment w:author="Iasmin Marques" w:id="43" w:date="2025-03-05T01:38:44Z">
+  <w:comment w:author="Iasmin Marques" w:id="73" w:date="2025-03-06T20:26:41Z">
     <w:p>
       <w:pPr>
         <w:keepNext w:val="0"/>
@@ -18314,11 +18764,11 @@
           <w:vertAlign w:val="baseline"/>
           <w:rtl w:val="0"/>
         </w:rPr>
-        <w:t xml:space="preserve">pagina 4 - artigo 4</w:t>
+        <w:t xml:space="preserve">pagina 50 - artigo 6</w:t>
       </w:r>
     </w:p>
   </w:comment>
-  <w:comment w:author="Iasmin Marques" w:id="51" w:date="2025-03-07T19:34:05Z">
+  <w:comment w:author="Iasmin Marques" w:id="14" w:date="2025-03-03T14:26:00Z">
     <w:p>
       <w:pPr>
         <w:keepNext w:val="0"/>
@@ -18365,11 +18815,11 @@
           <w:vertAlign w:val="baseline"/>
           <w:rtl w:val="0"/>
         </w:rPr>
-        <w:t xml:space="preserve">fazer um topico so pra ele</w:t>
+        <w:t xml:space="preserve">paginas 21 e 110 - artigo_2</w:t>
       </w:r>
     </w:p>
   </w:comment>
-  <w:comment w:author="Iasmin Marques" w:id="48" w:date="2025-03-05T00:50:28Z">
+  <w:comment w:author="Iasmin Marques" w:id="85" w:date="2025-03-05T00:44:22Z">
     <w:p>
       <w:pPr>
         <w:keepNext w:val="0"/>
@@ -18416,11 +18866,11 @@
           <w:vertAlign w:val="baseline"/>
           <w:rtl w:val="0"/>
         </w:rPr>
-        <w:t xml:space="preserve">pagina 2 - artigo 4</w:t>
+        <w:t xml:space="preserve">referencia utilizada no artigo 4 (citação utilizada no referencial teorico 3.1)</w:t>
       </w:r>
     </w:p>
   </w:comment>
-  <w:comment w:author="Iasmin Marques" w:id="55" w:date="2025-03-06T19:50:37Z">
+  <w:comment w:author="Iasmin Marques" w:id="77" w:date="2025-02-24T17:15:37Z">
     <w:p>
       <w:pPr>
         <w:keepNext w:val="0"/>
@@ -18467,11 +18917,11 @@
           <w:vertAlign w:val="baseline"/>
           <w:rtl w:val="0"/>
         </w:rPr>
-        <w:t xml:space="preserve">ref boa em machinelearnign .... pg 16</w:t>
+        <w:t xml:space="preserve">no TCC 2 - vai falar do KDD;</w:t>
       </w:r>
     </w:p>
   </w:comment>
-  <w:comment w:author="Iasmin Marques" w:id="50" w:date="2025-03-05T01:54:14Z">
+  <w:comment w:author="Iasmin Marques" w:id="44" w:date="2025-03-07T19:25:44Z">
     <w:p>
       <w:pPr>
         <w:keepNext w:val="0"/>
@@ -18518,11 +18968,11 @@
           <w:vertAlign w:val="baseline"/>
           <w:rtl w:val="0"/>
         </w:rPr>
-        <w:t xml:space="preserve">pagina 23,21 - artigo 2</w:t>
+        <w:t xml:space="preserve">alterar imagem para texto</w:t>
       </w:r>
     </w:p>
   </w:comment>
-  <w:comment w:author="Iasmin Marques" w:id="52" w:date="2025-03-05T02:23:15Z">
+  <w:comment w:author="Iasmin Marques" w:id="70" w:date="2025-03-06T20:16:42Z">
     <w:p>
       <w:pPr>
         <w:keepNext w:val="0"/>
@@ -18569,11 +19019,11 @@
           <w:vertAlign w:val="baseline"/>
           <w:rtl w:val="0"/>
         </w:rPr>
-        <w:t xml:space="preserve">adicionar formulas - exemplo artigo 7</w:t>
+        <w:t xml:space="preserve">p. 1 - artigo_4</w:t>
       </w:r>
     </w:p>
   </w:comment>
-  <w:comment w:author="Iasmin Marques" w:id="56" w:date="2025-03-05T02:11:12Z">
+  <w:comment w:author="Iasmin Marques" w:id="71" w:date="2025-03-06T20:16:42Z">
     <w:p>
       <w:pPr>
         <w:keepNext w:val="0"/>
@@ -18620,11 +19070,11 @@
           <w:vertAlign w:val="baseline"/>
           <w:rtl w:val="0"/>
         </w:rPr>
-        <w:t xml:space="preserve">pagina 10 - machinalearnigprevisaocovid</w:t>
+        <w:t xml:space="preserve">p. 1 - artigo_4</w:t>
       </w:r>
     </w:p>
   </w:comment>
-  <w:comment w:author="Iasmin Marques" w:id="8" w:date="2025-03-03T13:55:47Z">
+  <w:comment w:author="Iasmin Marques" w:id="47" w:date="2025-03-06T19:30:24Z">
     <w:p>
       <w:pPr>
         <w:keepNext w:val="0"/>
@@ -18671,11 +19121,11 @@
           <w:vertAlign w:val="baseline"/>
           <w:rtl w:val="0"/>
         </w:rPr>
-        <w:t xml:space="preserve">pagina 19 - artigo 2</w:t>
+        <w:t xml:space="preserve">pagina 53 - dissertacao_uallaci</w:t>
       </w:r>
     </w:p>
   </w:comment>
-  <w:comment w:author="Iasmin Marques" w:id="16" w:date="2025-03-03T15:33:02Z">
+  <w:comment w:author="Iasmin Marques" w:id="83" w:date="2025-03-05T02:45:07Z">
     <w:p>
       <w:pPr>
         <w:keepNext w:val="0"/>
@@ -18722,11 +19172,11 @@
           <w:vertAlign w:val="baseline"/>
           <w:rtl w:val="0"/>
         </w:rPr>
-        <w:t xml:space="preserve">pagina 16 - dissertacaouallaci</w:t>
+        <w:t xml:space="preserve">verificar se vai mostrar já essa parte</w:t>
       </w:r>
     </w:p>
   </w:comment>
-  <w:comment w:author="Iasmin Marques" w:id="17" w:date="2025-03-03T15:33:22Z">
+  <w:comment w:author="Iasmin Marques" w:id="7" w:date="2025-03-03T13:34:01Z">
     <w:p>
       <w:pPr>
         <w:keepNext w:val="0"/>
@@ -18773,11 +19223,11 @@
           <w:vertAlign w:val="baseline"/>
           <w:rtl w:val="0"/>
         </w:rPr>
-        <w:t xml:space="preserve">* verificar se pode utilizar</w:t>
+        <w:t xml:space="preserve">pagina 21 - artigo 2</w:t>
       </w:r>
     </w:p>
   </w:comment>
-  <w:comment w:author="Iasmin Marques" w:id="27" w:date="2025-03-03T15:33:02Z">
+  <w:comment w:author="Iasmin Marques" w:id="62" w:date="2025-03-05T02:22:01Z">
     <w:p>
       <w:pPr>
         <w:keepNext w:val="0"/>
@@ -18824,11 +19274,11 @@
           <w:vertAlign w:val="baseline"/>
           <w:rtl w:val="0"/>
         </w:rPr>
-        <w:t xml:space="preserve">pagina 16 - dissertacaouallaci</w:t>
+        <w:t xml:space="preserve">pegar no machinelearins...covid</w:t>
       </w:r>
     </w:p>
   </w:comment>
-  <w:comment w:author="Iasmin Marques" w:id="28" w:date="2025-03-03T15:33:22Z">
+  <w:comment w:author="Iasmin Marques" w:id="72" w:date="2025-03-06T20:26:31Z">
     <w:p>
       <w:pPr>
         <w:keepNext w:val="0"/>
@@ -18875,11 +19325,11 @@
           <w:vertAlign w:val="baseline"/>
           <w:rtl w:val="0"/>
         </w:rPr>
-        <w:t xml:space="preserve">* verificar se pode utilizar</w:t>
+        <w:t xml:space="preserve">pagina 50 - artigo 6 (olhar bem)</w:t>
       </w:r>
     </w:p>
   </w:comment>
-  <w:comment w:author="Iasmin Marques" w:id="3" w:date="2025-02-24T17:20:55Z">
+  <w:comment w:author="Iasmin Marques" w:id="66" w:date="2025-03-05T02:25:03Z">
     <w:p>
       <w:pPr>
         <w:keepNext w:val="0"/>
@@ -18926,11 +19376,11 @@
           <w:vertAlign w:val="baseline"/>
           <w:rtl w:val="0"/>
         </w:rPr>
-        <w:t xml:space="preserve">kdd - comentar sobre no 2</w:t>
+        <w:t xml:space="preserve">pagina 120, 121 - artigo 7</w:t>
       </w:r>
     </w:p>
   </w:comment>
-  <w:comment w:author="Iasmin Marques" w:id="4" w:date="2025-03-07T17:40:41Z">
+  <w:comment w:author="Iasmin Marques" w:id="26" w:date="2025-03-05T00:39:26Z">
     <w:p>
       <w:pPr>
         <w:keepNext w:val="0"/>
@@ -18977,11 +19427,11 @@
           <w:vertAlign w:val="baseline"/>
           <w:rtl w:val="0"/>
         </w:rPr>
-        <w:t xml:space="preserve">modificar nome para kdd</w:t>
+        <w:t xml:space="preserve">pagina 11 - dissertacao uallaci</w:t>
       </w:r>
     </w:p>
   </w:comment>
-  <w:comment w:author="Iasmin Marques" w:id="39" w:date="2025-02-24T17:20:55Z">
+  <w:comment w:author="Iasmin Marques" w:id="6" w:date="2025-03-03T13:34:29Z">
     <w:p>
       <w:pPr>
         <w:keepNext w:val="0"/>
@@ -19028,11 +19478,11 @@
           <w:vertAlign w:val="baseline"/>
           <w:rtl w:val="0"/>
         </w:rPr>
-        <w:t xml:space="preserve">kdd - comentar sobre no 2</w:t>
+        <w:t xml:space="preserve">pagina 119 - artigo 7</w:t>
       </w:r>
     </w:p>
   </w:comment>
-  <w:comment w:author="Iasmin Marques" w:id="40" w:date="2025-03-07T17:40:41Z">
+  <w:comment w:author="Iasmin Marques" w:id="41" w:date="2025-03-06T19:21:47Z">
     <w:p>
       <w:pPr>
         <w:keepNext w:val="0"/>
@@ -19079,11 +19529,11 @@
           <w:vertAlign w:val="baseline"/>
           <w:rtl w:val="0"/>
         </w:rPr>
-        <w:t xml:space="preserve">modificar nome para kdd</w:t>
+        <w:t xml:space="preserve">pagina 52 - dissertacao_uallaci</w:t>
       </w:r>
     </w:p>
   </w:comment>
-  <w:comment w:author="Iasmin Marques" w:id="57" w:date="2025-03-05T02:15:54Z">
+  <w:comment w:author="Iasmin Marques" w:id="84" w:date="2025-02-27T21:35:21Z">
     <w:p>
       <w:pPr>
         <w:keepNext w:val="0"/>
@@ -19130,11 +19580,11 @@
           <w:vertAlign w:val="baseline"/>
           <w:rtl w:val="0"/>
         </w:rPr>
-        <w:t xml:space="preserve">PAGINA 22 e 12 - DISSERATCAO UALLaci</w:t>
+        <w:t xml:space="preserve">verificar se é valido</w:t>
       </w:r>
     </w:p>
   </w:comment>
-  <w:comment w:author="Iasmin Marques" w:id="12" w:date="2025-03-03T14:09:06Z">
+  <w:comment w:author="Iasmin Marques" w:id="5" w:date="2025-03-03T13:35:10Z">
     <w:p>
       <w:pPr>
         <w:keepNext w:val="0"/>
@@ -19181,11 +19631,11 @@
           <w:vertAlign w:val="baseline"/>
           <w:rtl w:val="0"/>
         </w:rPr>
-        <w:t xml:space="preserve">pagina 27,28,29 -  machinelearningprevisaocovid</w:t>
+        <w:t xml:space="preserve">pagina 1725 - artigo_sus</w:t>
       </w:r>
     </w:p>
   </w:comment>
-  <w:comment w:author="Iasmin Marques" w:id="65" w:date="2025-03-06T20:10:33Z">
+  <w:comment w:author="Iasmin Marques" w:id="58" w:date="2025-03-05T02:04:20Z">
     <w:p>
       <w:pPr>
         <w:keepNext w:val="0"/>
@@ -19232,11 +19682,11 @@
           <w:vertAlign w:val="baseline"/>
           <w:rtl w:val="0"/>
         </w:rPr>
-        <w:t xml:space="preserve">pagina 49 - artigo 6</w:t>
+        <w:t xml:space="preserve">pagina 3 - artigo 4</w:t>
       </w:r>
     </w:p>
   </w:comment>
-  <w:comment w:author="Iasmin Marques" w:id="22" w:date="2025-03-03T15:45:59Z">
+  <w:comment w:author="Iasmin Marques" w:id="10" w:date="2025-02-24T13:18:29Z">
     <w:p>
       <w:pPr>
         <w:keepNext w:val="0"/>
@@ -19283,9 +19733,11 @@
           <w:vertAlign w:val="baseline"/>
           <w:rtl w:val="0"/>
         </w:rPr>
-        <w:t xml:space="preserve">pagina 2 - artigo_4</w:t>
-      </w:r>
-    </w:p>
+        <w:t xml:space="preserve">add nota de rodapé</w:t>
+      </w:r>
+    </w:p>
+  </w:comment>
+  <w:comment w:author="Iasmin Marques" w:id="23" w:date="2025-03-07T16:56:18Z">
     <w:p>
       <w:pPr>
         <w:keepNext w:val="0"/>
@@ -19332,11 +19784,11 @@
           <w:vertAlign w:val="baseline"/>
           <w:rtl w:val="0"/>
         </w:rPr>
-        <w:t xml:space="preserve">em trabalhos relacionados</w:t>
+        <w:t xml:space="preserve">Add rodapé?</w:t>
       </w:r>
     </w:p>
   </w:comment>
-  <w:comment w:author="Iasmin Marques" w:id="33" w:date="2025-03-03T15:45:59Z">
+  <w:comment w:author="Iasmin Marques" w:id="11" w:date="2025-02-24T13:16:06Z">
     <w:p>
       <w:pPr>
         <w:keepNext w:val="0"/>
@@ -19383,9 +19835,11 @@
           <w:vertAlign w:val="baseline"/>
           <w:rtl w:val="0"/>
         </w:rPr>
-        <w:t xml:space="preserve">pagina 2 - artigo_4</w:t>
-      </w:r>
-    </w:p>
+        <w:t xml:space="preserve">adicionar o significado no rodapé</w:t>
+      </w:r>
+    </w:p>
+  </w:comment>
+  <w:comment w:author="Iasmin Marques" w:id="75" w:date="2025-02-19T16:32:43Z">
     <w:p>
       <w:pPr>
         <w:keepNext w:val="0"/>
@@ -19432,11 +19886,11 @@
           <w:vertAlign w:val="baseline"/>
           <w:rtl w:val="0"/>
         </w:rPr>
-        <w:t xml:space="preserve">em trabalhos relacionados</w:t>
+        <w:t xml:space="preserve">verificar qual palavra e melhor</w:t>
       </w:r>
     </w:p>
   </w:comment>
-  <w:comment w:author="Iasmin Marques" w:id="34" w:date="2025-03-07T18:20:55Z">
+  <w:comment w:author="Iasmin Marques" w:id="36" w:date="2025-03-05T01:13:35Z">
     <w:p>
       <w:pPr>
         <w:keepNext w:val="0"/>
@@ -19483,11 +19937,11 @@
           <w:vertAlign w:val="baseline"/>
           <w:rtl w:val="0"/>
         </w:rPr>
-        <w:t xml:space="preserve">pagina 14 - dissetação uallaci</w:t>
+        <w:t xml:space="preserve">pagina 2 - machinelearinigprevisaocovid</w:t>
       </w:r>
     </w:p>
   </w:comment>
-  <w:comment w:author="Iasmin Marques" w:id="35" w:date="2025-03-07T18:21:11Z">
+  <w:comment w:author="Iasmin Marques" w:id="50" w:date="2025-03-08T00:23:09Z">
     <w:p>
       <w:pPr>
         <w:keepNext w:val="0"/>
@@ -19534,11 +19988,11 @@
           <w:vertAlign w:val="baseline"/>
           <w:rtl w:val="0"/>
         </w:rPr>
-        <w:t xml:space="preserve">verificar se esta correta, pq é um citação de uma citação</w:t>
+        <w:t xml:space="preserve">Verificar a referência (artigo 6 - página 24)</w:t>
       </w:r>
     </w:p>
   </w:comment>
-  <w:comment w:author="Iasmin Marques" w:id="15" w:date="2025-03-03T14:30:31Z">
+  <w:comment w:author="Iasmin Marques" w:id="13" w:date="2025-03-03T14:12:08Z">
     <w:p>
       <w:pPr>
         <w:keepNext w:val="0"/>
@@ -19585,11 +20039,11 @@
           <w:vertAlign w:val="baseline"/>
           <w:rtl w:val="0"/>
         </w:rPr>
-        <w:t xml:space="preserve">pagina 119 - artigo 7</w:t>
+        <w:t xml:space="preserve">pagina 28 - dissertacao uallaci</w:t>
       </w:r>
     </w:p>
   </w:comment>
-  <w:comment w:author="Iasmin Marques" w:id="1" w:date="2025-02-24T14:09:16Z">
+  <w:comment w:author="Iasmin Marques" w:id="64" w:date="2025-03-06T19:48:08Z">
     <w:p>
       <w:pPr>
         <w:keepNext w:val="0"/>
@@ -19636,11 +20090,11 @@
           <w:vertAlign w:val="baseline"/>
           <w:rtl w:val="0"/>
         </w:rPr>
-        <w:t xml:space="preserve">verificar se a estrutura esta ok</w:t>
+        <w:t xml:space="preserve">pagina 17 e 18 - machinelearningprevisaocovid.pdf</w:t>
       </w:r>
     </w:p>
   </w:comment>
-  <w:comment w:author="Iasmin Marques" w:id="42" w:date="2025-03-05T01:32:51Z">
+  <w:comment w:author="Iasmin Marques" w:id="24" w:date="2025-03-05T00:46:53Z">
     <w:p>
       <w:pPr>
         <w:keepNext w:val="0"/>
@@ -19687,11 +20141,11 @@
           <w:vertAlign w:val="baseline"/>
           <w:rtl w:val="0"/>
         </w:rPr>
-        <w:t xml:space="preserve">pagina 44 - artigo 2</w:t>
+        <w:t xml:space="preserve">pagina 2 - artigo 4</w:t>
       </w:r>
     </w:p>
   </w:comment>
-  <w:comment w:author="Iasmin Marques" w:id="45" w:date="2025-03-06T19:17:43Z">
+  <w:comment w:author="Iasmin Marques" w:id="51" w:date="2025-03-05T00:50:28Z">
     <w:p>
       <w:pPr>
         <w:keepNext w:val="0"/>
@@ -19738,11 +20192,11 @@
           <w:vertAlign w:val="baseline"/>
           <w:rtl w:val="0"/>
         </w:rPr>
-        <w:t xml:space="preserve">talvez de uallaci (pg 51)</w:t>
+        <w:t xml:space="preserve">pagina 2 - artigo 4</w:t>
       </w:r>
     </w:p>
   </w:comment>
-  <w:comment w:author="Iasmin Marques" w:id="63" w:date="2025-03-05T02:28:12Z">
+  <w:comment w:author="Iasmin Marques" w:id="59" w:date="2025-03-06T19:50:37Z">
     <w:p>
       <w:pPr>
         <w:keepNext w:val="0"/>
@@ -19789,11 +20243,11 @@
           <w:vertAlign w:val="baseline"/>
           <w:rtl w:val="0"/>
         </w:rPr>
-        <w:t xml:space="preserve">pegar do artigo 6</w:t>
+        <w:t xml:space="preserve">ref boa em machinelearnign .... pg 16</w:t>
       </w:r>
     </w:p>
   </w:comment>
-  <w:comment w:author="Iasmin Marques" w:id="64" w:date="2025-03-05T02:29:07Z">
+  <w:comment w:author="Iasmin Marques" w:id="16" w:date="2025-03-03T15:33:02Z">
     <w:p>
       <w:pPr>
         <w:keepNext w:val="0"/>
@@ -19840,11 +20294,11 @@
           <w:vertAlign w:val="baseline"/>
           <w:rtl w:val="0"/>
         </w:rPr>
-        <w:t xml:space="preserve">3.4.4</w:t>
+        <w:t xml:space="preserve">pagina 16 - dissertacaouallaci</w:t>
       </w:r>
     </w:p>
   </w:comment>
-  <w:comment w:author="Iasmin Marques" w:id="72" w:date="2025-02-24T17:24:54Z">
+  <w:comment w:author="Iasmin Marques" w:id="17" w:date="2025-03-03T15:33:22Z">
     <w:p>
       <w:pPr>
         <w:keepNext w:val="0"/>
@@ -19891,11 +20345,11 @@
           <w:vertAlign w:val="baseline"/>
           <w:rtl w:val="0"/>
         </w:rPr>
-        <w:t xml:space="preserve">esse é o kdd</w:t>
+        <w:t xml:space="preserve">* verificar se pode utilizar</w:t>
       </w:r>
     </w:p>
   </w:comment>
-  <w:comment w:author="Iasmin Marques" w:id="20" w:date="2025-03-07T16:29:59Z">
+  <w:comment w:author="Iasmin Marques" w:id="27" w:date="2025-03-03T15:33:02Z">
     <w:p>
       <w:pPr>
         <w:keepNext w:val="0"/>
@@ -19942,11 +20396,11 @@
           <w:vertAlign w:val="baseline"/>
           <w:rtl w:val="0"/>
         </w:rPr>
-        <w:t xml:space="preserve">Adicionar nota de rodapé?</w:t>
+        <w:t xml:space="preserve">pagina 16 - dissertacaouallaci</w:t>
       </w:r>
     </w:p>
   </w:comment>
-  <w:comment w:author="Iasmin Marques" w:id="31" w:date="2025-03-07T16:29:59Z">
+  <w:comment w:author="Iasmin Marques" w:id="28" w:date="2025-03-03T15:33:22Z">
     <w:p>
       <w:pPr>
         <w:keepNext w:val="0"/>
@@ -19993,11 +20447,11 @@
           <w:vertAlign w:val="baseline"/>
           <w:rtl w:val="0"/>
         </w:rPr>
-        <w:t xml:space="preserve">Adicionar nota de rodapé?</w:t>
+        <w:t xml:space="preserve">* verificar se pode utilizar</w:t>
       </w:r>
     </w:p>
   </w:comment>
-  <w:comment w:author="Iasmin Marques" w:id="2" w:date="2025-03-07T17:40:11Z">
+  <w:comment w:author="Iasmin Marques" w:id="3" w:date="2025-02-24T17:20:55Z">
     <w:p>
       <w:pPr>
         <w:keepNext w:val="0"/>
@@ -20044,7 +20498,466 @@
           <w:vertAlign w:val="baseline"/>
           <w:rtl w:val="0"/>
         </w:rPr>
-        <w:t xml:space="preserve">generalizar - nao focar em saude</w:t>
+        <w:t xml:space="preserve">kdd - comentar sobre no 2</w:t>
+      </w:r>
+    </w:p>
+  </w:comment>
+  <w:comment w:author="Iasmin Marques" w:id="4" w:date="2025-03-07T17:40:41Z">
+    <w:p>
+      <w:pPr>
+        <w:keepNext w:val="0"/>
+        <w:keepLines w:val="0"/>
+        <w:pageBreakBefore w:val="0"/>
+        <w:widowControl w:val="0"/>
+        <w:pBdr>
+          <w:top w:space="0" w:sz="0" w:val="nil"/>
+          <w:left w:space="0" w:sz="0" w:val="nil"/>
+          <w:bottom w:space="0" w:sz="0" w:val="nil"/>
+          <w:right w:space="0" w:sz="0" w:val="nil"/>
+          <w:between w:space="0" w:sz="0" w:val="nil"/>
+        </w:pBdr>
+        <w:shd w:fill="auto" w:val="clear"/>
+        <w:spacing w:after="0" w:before="0" w:line="240" w:lineRule="auto"/>
+        <w:ind w:left="0" w:right="0" w:firstLine="0"/>
+        <w:jc w:val="left"/>
+        <w:rPr>
+          <w:rFonts w:ascii="Arial" w:cs="Arial" w:eastAsia="Arial" w:hAnsi="Arial"/>
+          <w:b w:val="0"/>
+          <w:i w:val="0"/>
+          <w:smallCaps w:val="0"/>
+          <w:strike w:val="0"/>
+          <w:color w:val="000000"/>
+          <w:sz w:val="22"/>
+          <w:szCs w:val="22"/>
+          <w:u w:val="none"/>
+          <w:shd w:fill="auto" w:val="clear"/>
+          <w:vertAlign w:val="baseline"/>
+        </w:rPr>
+      </w:pPr>
+      <w:r>
+        <w:rPr>
+          <w:rFonts w:ascii="Arial" w:cs="Arial" w:eastAsia="Arial" w:hAnsi="Arial"/>
+          <w:b w:val="0"/>
+          <w:i w:val="0"/>
+          <w:smallCaps w:val="0"/>
+          <w:strike w:val="0"/>
+          <w:color w:val="000000"/>
+          <w:sz w:val="22"/>
+          <w:szCs w:val="22"/>
+          <w:u w:val="none"/>
+          <w:shd w:fill="auto" w:val="clear"/>
+          <w:vertAlign w:val="baseline"/>
+          <w:rtl w:val="0"/>
+        </w:rPr>
+        <w:t xml:space="preserve">modificar nome para kdd</w:t>
+      </w:r>
+    </w:p>
+  </w:comment>
+  <w:comment w:author="Iasmin Marques" w:id="39" w:date="2025-02-24T17:20:55Z">
+    <w:p>
+      <w:pPr>
+        <w:keepNext w:val="0"/>
+        <w:keepLines w:val="0"/>
+        <w:pageBreakBefore w:val="0"/>
+        <w:widowControl w:val="0"/>
+        <w:pBdr>
+          <w:top w:space="0" w:sz="0" w:val="nil"/>
+          <w:left w:space="0" w:sz="0" w:val="nil"/>
+          <w:bottom w:space="0" w:sz="0" w:val="nil"/>
+          <w:right w:space="0" w:sz="0" w:val="nil"/>
+          <w:between w:space="0" w:sz="0" w:val="nil"/>
+        </w:pBdr>
+        <w:shd w:fill="auto" w:val="clear"/>
+        <w:spacing w:after="0" w:before="0" w:line="240" w:lineRule="auto"/>
+        <w:ind w:left="0" w:right="0" w:firstLine="0"/>
+        <w:jc w:val="left"/>
+        <w:rPr>
+          <w:rFonts w:ascii="Arial" w:cs="Arial" w:eastAsia="Arial" w:hAnsi="Arial"/>
+          <w:b w:val="0"/>
+          <w:i w:val="0"/>
+          <w:smallCaps w:val="0"/>
+          <w:strike w:val="0"/>
+          <w:color w:val="000000"/>
+          <w:sz w:val="22"/>
+          <w:szCs w:val="22"/>
+          <w:u w:val="none"/>
+          <w:shd w:fill="auto" w:val="clear"/>
+          <w:vertAlign w:val="baseline"/>
+        </w:rPr>
+      </w:pPr>
+      <w:r>
+        <w:rPr>
+          <w:rFonts w:ascii="Arial" w:cs="Arial" w:eastAsia="Arial" w:hAnsi="Arial"/>
+          <w:b w:val="0"/>
+          <w:i w:val="0"/>
+          <w:smallCaps w:val="0"/>
+          <w:strike w:val="0"/>
+          <w:color w:val="000000"/>
+          <w:sz w:val="22"/>
+          <w:szCs w:val="22"/>
+          <w:u w:val="none"/>
+          <w:shd w:fill="auto" w:val="clear"/>
+          <w:vertAlign w:val="baseline"/>
+          <w:rtl w:val="0"/>
+        </w:rPr>
+        <w:t xml:space="preserve">kdd - comentar sobre no 2</w:t>
+      </w:r>
+    </w:p>
+  </w:comment>
+  <w:comment w:author="Iasmin Marques" w:id="40" w:date="2025-03-07T17:40:41Z">
+    <w:p>
+      <w:pPr>
+        <w:keepNext w:val="0"/>
+        <w:keepLines w:val="0"/>
+        <w:pageBreakBefore w:val="0"/>
+        <w:widowControl w:val="0"/>
+        <w:pBdr>
+          <w:top w:space="0" w:sz="0" w:val="nil"/>
+          <w:left w:space="0" w:sz="0" w:val="nil"/>
+          <w:bottom w:space="0" w:sz="0" w:val="nil"/>
+          <w:right w:space="0" w:sz="0" w:val="nil"/>
+          <w:between w:space="0" w:sz="0" w:val="nil"/>
+        </w:pBdr>
+        <w:shd w:fill="auto" w:val="clear"/>
+        <w:spacing w:after="0" w:before="0" w:line="240" w:lineRule="auto"/>
+        <w:ind w:left="0" w:right="0" w:firstLine="0"/>
+        <w:jc w:val="left"/>
+        <w:rPr>
+          <w:rFonts w:ascii="Arial" w:cs="Arial" w:eastAsia="Arial" w:hAnsi="Arial"/>
+          <w:b w:val="0"/>
+          <w:i w:val="0"/>
+          <w:smallCaps w:val="0"/>
+          <w:strike w:val="0"/>
+          <w:color w:val="000000"/>
+          <w:sz w:val="22"/>
+          <w:szCs w:val="22"/>
+          <w:u w:val="none"/>
+          <w:shd w:fill="auto" w:val="clear"/>
+          <w:vertAlign w:val="baseline"/>
+        </w:rPr>
+      </w:pPr>
+      <w:r>
+        <w:rPr>
+          <w:rFonts w:ascii="Arial" w:cs="Arial" w:eastAsia="Arial" w:hAnsi="Arial"/>
+          <w:b w:val="0"/>
+          <w:i w:val="0"/>
+          <w:smallCaps w:val="0"/>
+          <w:strike w:val="0"/>
+          <w:color w:val="000000"/>
+          <w:sz w:val="22"/>
+          <w:szCs w:val="22"/>
+          <w:u w:val="none"/>
+          <w:shd w:fill="auto" w:val="clear"/>
+          <w:vertAlign w:val="baseline"/>
+          <w:rtl w:val="0"/>
+        </w:rPr>
+        <w:t xml:space="preserve">modificar nome para kdd</w:t>
+      </w:r>
+    </w:p>
+  </w:comment>
+  <w:comment w:author="Iasmin Marques" w:id="12" w:date="2025-03-03T14:09:06Z">
+    <w:p>
+      <w:pPr>
+        <w:keepNext w:val="0"/>
+        <w:keepLines w:val="0"/>
+        <w:pageBreakBefore w:val="0"/>
+        <w:widowControl w:val="0"/>
+        <w:pBdr>
+          <w:top w:space="0" w:sz="0" w:val="nil"/>
+          <w:left w:space="0" w:sz="0" w:val="nil"/>
+          <w:bottom w:space="0" w:sz="0" w:val="nil"/>
+          <w:right w:space="0" w:sz="0" w:val="nil"/>
+          <w:between w:space="0" w:sz="0" w:val="nil"/>
+        </w:pBdr>
+        <w:shd w:fill="auto" w:val="clear"/>
+        <w:spacing w:after="0" w:before="0" w:line="240" w:lineRule="auto"/>
+        <w:ind w:left="0" w:right="0" w:firstLine="0"/>
+        <w:jc w:val="left"/>
+        <w:rPr>
+          <w:rFonts w:ascii="Arial" w:cs="Arial" w:eastAsia="Arial" w:hAnsi="Arial"/>
+          <w:b w:val="0"/>
+          <w:i w:val="0"/>
+          <w:smallCaps w:val="0"/>
+          <w:strike w:val="0"/>
+          <w:color w:val="000000"/>
+          <w:sz w:val="22"/>
+          <w:szCs w:val="22"/>
+          <w:u w:val="none"/>
+          <w:shd w:fill="auto" w:val="clear"/>
+          <w:vertAlign w:val="baseline"/>
+        </w:rPr>
+      </w:pPr>
+      <w:r>
+        <w:rPr>
+          <w:rFonts w:ascii="Arial" w:cs="Arial" w:eastAsia="Arial" w:hAnsi="Arial"/>
+          <w:b w:val="0"/>
+          <w:i w:val="0"/>
+          <w:smallCaps w:val="0"/>
+          <w:strike w:val="0"/>
+          <w:color w:val="000000"/>
+          <w:sz w:val="22"/>
+          <w:szCs w:val="22"/>
+          <w:u w:val="none"/>
+          <w:shd w:fill="auto" w:val="clear"/>
+          <w:vertAlign w:val="baseline"/>
+          <w:rtl w:val="0"/>
+        </w:rPr>
+        <w:t xml:space="preserve">pagina 27,28,29 -  machinelearningprevisaocovid</w:t>
+      </w:r>
+    </w:p>
+  </w:comment>
+  <w:comment w:author="Iasmin Marques" w:id="67" w:date="2025-03-05T02:28:12Z">
+    <w:p>
+      <w:pPr>
+        <w:keepNext w:val="0"/>
+        <w:keepLines w:val="0"/>
+        <w:pageBreakBefore w:val="0"/>
+        <w:widowControl w:val="0"/>
+        <w:pBdr>
+          <w:top w:space="0" w:sz="0" w:val="nil"/>
+          <w:left w:space="0" w:sz="0" w:val="nil"/>
+          <w:bottom w:space="0" w:sz="0" w:val="nil"/>
+          <w:right w:space="0" w:sz="0" w:val="nil"/>
+          <w:between w:space="0" w:sz="0" w:val="nil"/>
+        </w:pBdr>
+        <w:shd w:fill="auto" w:val="clear"/>
+        <w:spacing w:after="0" w:before="0" w:line="240" w:lineRule="auto"/>
+        <w:ind w:left="0" w:right="0" w:firstLine="0"/>
+        <w:jc w:val="left"/>
+        <w:rPr>
+          <w:rFonts w:ascii="Arial" w:cs="Arial" w:eastAsia="Arial" w:hAnsi="Arial"/>
+          <w:b w:val="0"/>
+          <w:i w:val="0"/>
+          <w:smallCaps w:val="0"/>
+          <w:strike w:val="0"/>
+          <w:color w:val="000000"/>
+          <w:sz w:val="22"/>
+          <w:szCs w:val="22"/>
+          <w:u w:val="none"/>
+          <w:shd w:fill="auto" w:val="clear"/>
+          <w:vertAlign w:val="baseline"/>
+        </w:rPr>
+      </w:pPr>
+      <w:r>
+        <w:rPr>
+          <w:rFonts w:ascii="Arial" w:cs="Arial" w:eastAsia="Arial" w:hAnsi="Arial"/>
+          <w:b w:val="0"/>
+          <w:i w:val="0"/>
+          <w:smallCaps w:val="0"/>
+          <w:strike w:val="0"/>
+          <w:color w:val="000000"/>
+          <w:sz w:val="22"/>
+          <w:szCs w:val="22"/>
+          <w:u w:val="none"/>
+          <w:shd w:fill="auto" w:val="clear"/>
+          <w:vertAlign w:val="baseline"/>
+          <w:rtl w:val="0"/>
+        </w:rPr>
+        <w:t xml:space="preserve">pegar do artigo 6</w:t>
+      </w:r>
+    </w:p>
+  </w:comment>
+  <w:comment w:author="Iasmin Marques" w:id="68" w:date="2025-03-05T02:29:07Z">
+    <w:p>
+      <w:pPr>
+        <w:keepNext w:val="0"/>
+        <w:keepLines w:val="0"/>
+        <w:pageBreakBefore w:val="0"/>
+        <w:widowControl w:val="0"/>
+        <w:pBdr>
+          <w:top w:space="0" w:sz="0" w:val="nil"/>
+          <w:left w:space="0" w:sz="0" w:val="nil"/>
+          <w:bottom w:space="0" w:sz="0" w:val="nil"/>
+          <w:right w:space="0" w:sz="0" w:val="nil"/>
+          <w:between w:space="0" w:sz="0" w:val="nil"/>
+        </w:pBdr>
+        <w:shd w:fill="auto" w:val="clear"/>
+        <w:spacing w:after="0" w:before="0" w:line="240" w:lineRule="auto"/>
+        <w:ind w:left="0" w:right="0" w:firstLine="0"/>
+        <w:jc w:val="left"/>
+        <w:rPr>
+          <w:rFonts w:ascii="Arial" w:cs="Arial" w:eastAsia="Arial" w:hAnsi="Arial"/>
+          <w:b w:val="0"/>
+          <w:i w:val="0"/>
+          <w:smallCaps w:val="0"/>
+          <w:strike w:val="0"/>
+          <w:color w:val="000000"/>
+          <w:sz w:val="22"/>
+          <w:szCs w:val="22"/>
+          <w:u w:val="none"/>
+          <w:shd w:fill="auto" w:val="clear"/>
+          <w:vertAlign w:val="baseline"/>
+        </w:rPr>
+      </w:pPr>
+      <w:r>
+        <w:rPr>
+          <w:rFonts w:ascii="Arial" w:cs="Arial" w:eastAsia="Arial" w:hAnsi="Arial"/>
+          <w:b w:val="0"/>
+          <w:i w:val="0"/>
+          <w:smallCaps w:val="0"/>
+          <w:strike w:val="0"/>
+          <w:color w:val="000000"/>
+          <w:sz w:val="22"/>
+          <w:szCs w:val="22"/>
+          <w:u w:val="none"/>
+          <w:shd w:fill="auto" w:val="clear"/>
+          <w:vertAlign w:val="baseline"/>
+          <w:rtl w:val="0"/>
+        </w:rPr>
+        <w:t xml:space="preserve">3.4.4</w:t>
+      </w:r>
+    </w:p>
+  </w:comment>
+  <w:comment w:author="Iasmin Marques" w:id="76" w:date="2025-02-24T17:24:54Z">
+    <w:p>
+      <w:pPr>
+        <w:keepNext w:val="0"/>
+        <w:keepLines w:val="0"/>
+        <w:pageBreakBefore w:val="0"/>
+        <w:widowControl w:val="0"/>
+        <w:pBdr>
+          <w:top w:space="0" w:sz="0" w:val="nil"/>
+          <w:left w:space="0" w:sz="0" w:val="nil"/>
+          <w:bottom w:space="0" w:sz="0" w:val="nil"/>
+          <w:right w:space="0" w:sz="0" w:val="nil"/>
+          <w:between w:space="0" w:sz="0" w:val="nil"/>
+        </w:pBdr>
+        <w:shd w:fill="auto" w:val="clear"/>
+        <w:spacing w:after="0" w:before="0" w:line="240" w:lineRule="auto"/>
+        <w:ind w:left="0" w:right="0" w:firstLine="0"/>
+        <w:jc w:val="left"/>
+        <w:rPr>
+          <w:rFonts w:ascii="Arial" w:cs="Arial" w:eastAsia="Arial" w:hAnsi="Arial"/>
+          <w:b w:val="0"/>
+          <w:i w:val="0"/>
+          <w:smallCaps w:val="0"/>
+          <w:strike w:val="0"/>
+          <w:color w:val="000000"/>
+          <w:sz w:val="22"/>
+          <w:szCs w:val="22"/>
+          <w:u w:val="none"/>
+          <w:shd w:fill="auto" w:val="clear"/>
+          <w:vertAlign w:val="baseline"/>
+        </w:rPr>
+      </w:pPr>
+      <w:r>
+        <w:rPr>
+          <w:rFonts w:ascii="Arial" w:cs="Arial" w:eastAsia="Arial" w:hAnsi="Arial"/>
+          <w:b w:val="0"/>
+          <w:i w:val="0"/>
+          <w:smallCaps w:val="0"/>
+          <w:strike w:val="0"/>
+          <w:color w:val="000000"/>
+          <w:sz w:val="22"/>
+          <w:szCs w:val="22"/>
+          <w:u w:val="none"/>
+          <w:shd w:fill="auto" w:val="clear"/>
+          <w:vertAlign w:val="baseline"/>
+          <w:rtl w:val="0"/>
+        </w:rPr>
+        <w:t xml:space="preserve">esse é o kdd</w:t>
+      </w:r>
+    </w:p>
+  </w:comment>
+  <w:comment w:author="Iasmin Marques" w:id="20" w:date="2025-03-07T16:29:59Z">
+    <w:p>
+      <w:pPr>
+        <w:keepNext w:val="0"/>
+        <w:keepLines w:val="0"/>
+        <w:pageBreakBefore w:val="0"/>
+        <w:widowControl w:val="0"/>
+        <w:pBdr>
+          <w:top w:space="0" w:sz="0" w:val="nil"/>
+          <w:left w:space="0" w:sz="0" w:val="nil"/>
+          <w:bottom w:space="0" w:sz="0" w:val="nil"/>
+          <w:right w:space="0" w:sz="0" w:val="nil"/>
+          <w:between w:space="0" w:sz="0" w:val="nil"/>
+        </w:pBdr>
+        <w:shd w:fill="auto" w:val="clear"/>
+        <w:spacing w:after="0" w:before="0" w:line="240" w:lineRule="auto"/>
+        <w:ind w:left="0" w:right="0" w:firstLine="0"/>
+        <w:jc w:val="left"/>
+        <w:rPr>
+          <w:rFonts w:ascii="Arial" w:cs="Arial" w:eastAsia="Arial" w:hAnsi="Arial"/>
+          <w:b w:val="0"/>
+          <w:i w:val="0"/>
+          <w:smallCaps w:val="0"/>
+          <w:strike w:val="0"/>
+          <w:color w:val="000000"/>
+          <w:sz w:val="22"/>
+          <w:szCs w:val="22"/>
+          <w:u w:val="none"/>
+          <w:shd w:fill="auto" w:val="clear"/>
+          <w:vertAlign w:val="baseline"/>
+        </w:rPr>
+      </w:pPr>
+      <w:r>
+        <w:rPr>
+          <w:rFonts w:ascii="Arial" w:cs="Arial" w:eastAsia="Arial" w:hAnsi="Arial"/>
+          <w:b w:val="0"/>
+          <w:i w:val="0"/>
+          <w:smallCaps w:val="0"/>
+          <w:strike w:val="0"/>
+          <w:color w:val="000000"/>
+          <w:sz w:val="22"/>
+          <w:szCs w:val="22"/>
+          <w:u w:val="none"/>
+          <w:shd w:fill="auto" w:val="clear"/>
+          <w:vertAlign w:val="baseline"/>
+          <w:rtl w:val="0"/>
+        </w:rPr>
+        <w:t xml:space="preserve">Adicionar nota de rodapé?</w:t>
+      </w:r>
+    </w:p>
+  </w:comment>
+  <w:comment w:author="Iasmin Marques" w:id="31" w:date="2025-03-07T16:29:59Z">
+    <w:p>
+      <w:pPr>
+        <w:keepNext w:val="0"/>
+        <w:keepLines w:val="0"/>
+        <w:pageBreakBefore w:val="0"/>
+        <w:widowControl w:val="0"/>
+        <w:pBdr>
+          <w:top w:space="0" w:sz="0" w:val="nil"/>
+          <w:left w:space="0" w:sz="0" w:val="nil"/>
+          <w:bottom w:space="0" w:sz="0" w:val="nil"/>
+          <w:right w:space="0" w:sz="0" w:val="nil"/>
+          <w:between w:space="0" w:sz="0" w:val="nil"/>
+        </w:pBdr>
+        <w:shd w:fill="auto" w:val="clear"/>
+        <w:spacing w:after="0" w:before="0" w:line="240" w:lineRule="auto"/>
+        <w:ind w:left="0" w:right="0" w:firstLine="0"/>
+        <w:jc w:val="left"/>
+        <w:rPr>
+          <w:rFonts w:ascii="Arial" w:cs="Arial" w:eastAsia="Arial" w:hAnsi="Arial"/>
+          <w:b w:val="0"/>
+          <w:i w:val="0"/>
+          <w:smallCaps w:val="0"/>
+          <w:strike w:val="0"/>
+          <w:color w:val="000000"/>
+          <w:sz w:val="22"/>
+          <w:szCs w:val="22"/>
+          <w:u w:val="none"/>
+          <w:shd w:fill="auto" w:val="clear"/>
+          <w:vertAlign w:val="baseline"/>
+        </w:rPr>
+      </w:pPr>
+      <w:r>
+        <w:rPr>
+          <w:rFonts w:ascii="Arial" w:cs="Arial" w:eastAsia="Arial" w:hAnsi="Arial"/>
+          <w:b w:val="0"/>
+          <w:i w:val="0"/>
+          <w:smallCaps w:val="0"/>
+          <w:strike w:val="0"/>
+          <w:color w:val="000000"/>
+          <w:sz w:val="22"/>
+          <w:szCs w:val="22"/>
+          <w:u w:val="none"/>
+          <w:shd w:fill="auto" w:val="clear"/>
+          <w:vertAlign w:val="baseline"/>
+          <w:rtl w:val="0"/>
+        </w:rPr>
+        <w:t xml:space="preserve">Adicionar nota de rodapé?</w:t>
       </w:r>
     </w:p>
   </w:comment>
@@ -20072,9 +20985,7 @@
   <w15:commentEx w15:paraId="00000224" w15:done="0"/>
   <w15:commentEx w15:paraId="00000225" w15:done="0"/>
   <w15:commentEx w15:paraId="00000226" w15:done="0"/>
-  <w15:commentEx w15:paraId="00000227" w15:done="0"/>
   <w15:commentEx w15:paraId="00000228" w15:done="0"/>
-  <w15:commentEx w15:paraId="00000229" w15:done="0"/>
   <w15:commentEx w15:paraId="0000022A" w15:done="0"/>
   <w15:commentEx w15:paraId="0000022B" w15:done="0"/>
   <w15:commentEx w15:paraId="0000022C" w15:done="0"/>
@@ -20086,11 +20997,11 @@
   <w15:commentEx w15:paraId="00000232" w15:done="0"/>
   <w15:commentEx w15:paraId="00000233" w15:done="0"/>
   <w15:commentEx w15:paraId="00000234" w15:done="0"/>
-  <w15:commentEx w15:paraId="00000235" w15:done="0"/>
   <w15:commentEx w15:paraId="00000236" w15:done="0"/>
-  <w15:commentEx w15:paraId="00000237" w15:done="0"/>
+  <w15:commentEx w15:paraId="00000238" w15:done="0"/>
   <w15:commentEx w15:paraId="00000239" w15:done="0"/>
-  <w15:commentEx w15:paraId="0000023B" w15:done="0"/>
+  <w15:commentEx w15:paraId="0000023A" w15:done="0"/>
+  <w15:commentEx w15:paraId="0000023B" w15:paraIdParent="0000023A" w15:done="0"/>
   <w15:commentEx w15:paraId="0000023C" w15:done="0"/>
   <w15:commentEx w15:paraId="0000023D" w15:done="0"/>
   <w15:commentEx w15:paraId="0000023E" w15:done="0"/>
@@ -20106,30 +21017,41 @@
   <w15:commentEx w15:paraId="00000248" w15:done="0"/>
   <w15:commentEx w15:paraId="00000249" w15:done="0"/>
   <w15:commentEx w15:paraId="0000024A" w15:done="0"/>
-  <w15:commentEx w15:paraId="0000024B" w15:paraIdParent="0000024A" w15:done="0"/>
+  <w15:commentEx w15:paraId="0000024B" w15:done="0"/>
   <w15:commentEx w15:paraId="0000024C" w15:done="0"/>
-  <w15:commentEx w15:paraId="0000024D" w15:paraIdParent="0000024C" w15:done="0"/>
+  <w15:commentEx w15:paraId="0000024D" w15:done="0"/>
   <w15:commentEx w15:paraId="0000024E" w15:done="0"/>
-  <w15:commentEx w15:paraId="0000024F" w15:paraIdParent="0000024E" w15:done="0"/>
+  <w15:commentEx w15:paraId="0000024F" w15:done="0"/>
   <w15:commentEx w15:paraId="00000250" w15:done="0"/>
-  <w15:commentEx w15:paraId="00000251" w15:paraIdParent="00000250" w15:done="0"/>
+  <w15:commentEx w15:paraId="00000251" w15:done="0"/>
   <w15:commentEx w15:paraId="00000252" w15:done="0"/>
   <w15:commentEx w15:paraId="00000253" w15:done="0"/>
   <w15:commentEx w15:paraId="00000254" w15:done="0"/>
+  <w15:commentEx w15:paraId="00000255" w15:done="0"/>
   <w15:commentEx w15:paraId="00000256" w15:done="0"/>
+  <w15:commentEx w15:paraId="00000257" w15:done="0"/>
   <w15:commentEx w15:paraId="00000258" w15:done="0"/>
   <w15:commentEx w15:paraId="00000259" w15:done="0"/>
-  <w15:commentEx w15:paraId="0000025A" w15:paraIdParent="00000259" w15:done="0"/>
+  <w15:commentEx w15:paraId="0000025A" w15:done="0"/>
   <w15:commentEx w15:paraId="0000025B" w15:done="0"/>
   <w15:commentEx w15:paraId="0000025C" w15:done="0"/>
   <w15:commentEx w15:paraId="0000025D" w15:done="0"/>
   <w15:commentEx w15:paraId="0000025E" w15:done="0"/>
   <w15:commentEx w15:paraId="0000025F" w15:done="0"/>
-  <w15:commentEx w15:paraId="00000260" w15:paraIdParent="0000025F" w15:done="0"/>
-  <w15:commentEx w15:paraId="00000261" w15:done="0"/>
+  <w15:commentEx w15:paraId="00000260" w15:done="0"/>
+  <w15:commentEx w15:paraId="00000261" w15:paraIdParent="00000260" w15:done="0"/>
   <w15:commentEx w15:paraId="00000262" w15:done="0"/>
-  <w15:commentEx w15:paraId="00000263" w15:done="0"/>
+  <w15:commentEx w15:paraId="00000263" w15:paraIdParent="00000262" w15:done="0"/>
   <w15:commentEx w15:paraId="00000264" w15:done="0"/>
+  <w15:commentEx w15:paraId="00000265" w15:paraIdParent="00000264" w15:done="0"/>
+  <w15:commentEx w15:paraId="00000266" w15:done="0"/>
+  <w15:commentEx w15:paraId="00000267" w15:paraIdParent="00000266" w15:done="0"/>
+  <w15:commentEx w15:paraId="00000268" w15:done="0"/>
+  <w15:commentEx w15:paraId="00000269" w15:done="0"/>
+  <w15:commentEx w15:paraId="0000026A" w15:paraIdParent="00000269" w15:done="0"/>
+  <w15:commentEx w15:paraId="0000026B" w15:done="0"/>
+  <w15:commentEx w15:paraId="0000026C" w15:done="0"/>
+  <w15:commentEx w15:paraId="0000026D" w15:done="0"/>
 </w15:commentsEx>
 </file>
 
@@ -22035,116 +22957,6 @@
     </w:lvl>
   </w:abstractNum>
   <w:abstractNum w:abstractNumId="17">
-    <w:lvl w:ilvl="0">
-      <w:start w:val="1"/>
-      <w:numFmt w:val="bullet"/>
-      <w:lvlText w:val="●"/>
-      <w:lvlJc w:val="left"/>
-      <w:pPr>
-        <w:ind w:left="720" w:hanging="360"/>
-      </w:pPr>
-      <w:rPr>
-        <w:u w:val="none"/>
-      </w:rPr>
-    </w:lvl>
-    <w:lvl w:ilvl="1">
-      <w:start w:val="1"/>
-      <w:numFmt w:val="bullet"/>
-      <w:lvlText w:val="○"/>
-      <w:lvlJc w:val="left"/>
-      <w:pPr>
-        <w:ind w:left="1440" w:hanging="360"/>
-      </w:pPr>
-      <w:rPr>
-        <w:u w:val="none"/>
-      </w:rPr>
-    </w:lvl>
-    <w:lvl w:ilvl="2">
-      <w:start w:val="1"/>
-      <w:numFmt w:val="bullet"/>
-      <w:lvlText w:val="■"/>
-      <w:lvlJc w:val="left"/>
-      <w:pPr>
-        <w:ind w:left="2160" w:hanging="360"/>
-      </w:pPr>
-      <w:rPr>
-        <w:u w:val="none"/>
-      </w:rPr>
-    </w:lvl>
-    <w:lvl w:ilvl="3">
-      <w:start w:val="1"/>
-      <w:numFmt w:val="bullet"/>
-      <w:lvlText w:val="●"/>
-      <w:lvlJc w:val="left"/>
-      <w:pPr>
-        <w:ind w:left="2880" w:hanging="360"/>
-      </w:pPr>
-      <w:rPr>
-        <w:u w:val="none"/>
-      </w:rPr>
-    </w:lvl>
-    <w:lvl w:ilvl="4">
-      <w:start w:val="1"/>
-      <w:numFmt w:val="bullet"/>
-      <w:lvlText w:val="○"/>
-      <w:lvlJc w:val="left"/>
-      <w:pPr>
-        <w:ind w:left="3600" w:hanging="360"/>
-      </w:pPr>
-      <w:rPr>
-        <w:u w:val="none"/>
-      </w:rPr>
-    </w:lvl>
-    <w:lvl w:ilvl="5">
-      <w:start w:val="1"/>
-      <w:numFmt w:val="bullet"/>
-      <w:lvlText w:val="■"/>
-      <w:lvlJc w:val="left"/>
-      <w:pPr>
-        <w:ind w:left="4320" w:hanging="360"/>
-      </w:pPr>
-      <w:rPr>
-        <w:u w:val="none"/>
-      </w:rPr>
-    </w:lvl>
-    <w:lvl w:ilvl="6">
-      <w:start w:val="1"/>
-      <w:numFmt w:val="bullet"/>
-      <w:lvlText w:val="●"/>
-      <w:lvlJc w:val="left"/>
-      <w:pPr>
-        <w:ind w:left="5040" w:hanging="360"/>
-      </w:pPr>
-      <w:rPr>
-        <w:u w:val="none"/>
-      </w:rPr>
-    </w:lvl>
-    <w:lvl w:ilvl="7">
-      <w:start w:val="1"/>
-      <w:numFmt w:val="bullet"/>
-      <w:lvlText w:val="○"/>
-      <w:lvlJc w:val="left"/>
-      <w:pPr>
-        <w:ind w:left="5760" w:hanging="360"/>
-      </w:pPr>
-      <w:rPr>
-        <w:u w:val="none"/>
-      </w:rPr>
-    </w:lvl>
-    <w:lvl w:ilvl="8">
-      <w:start w:val="1"/>
-      <w:numFmt w:val="bullet"/>
-      <w:lvlText w:val="■"/>
-      <w:lvlJc w:val="left"/>
-      <w:pPr>
-        <w:ind w:left="6480" w:hanging="360"/>
-      </w:pPr>
-      <w:rPr>
-        <w:u w:val="none"/>
-      </w:rPr>
-    </w:lvl>
-  </w:abstractNum>
-  <w:abstractNum w:abstractNumId="18">
     <w:lvl w:ilvl="0">
       <w:start w:val="1"/>
       <w:numFmt w:val="bullet"/>
@@ -22304,9 +23116,6 @@
   </w:num>
   <w:num w:numId="17">
     <w:abstractNumId w:val="17"/>
-  </w:num>
-  <w:num w:numId="18">
-    <w:abstractNumId w:val="18"/>
   </w:num>
 </w:numbering>
 </file>
@@ -22887,7 +23696,7 @@
 
 <file path=customXML/item1.xml><?xml version="1.0" encoding="utf-8"?>
 <go:gDocsCustomXmlDataStorage xmlns:go="http://customooxmlschemas.google.com/" xmlns:r="http://schemas.openxmlformats.org/officeDocument/2006/relationships" uri="GoogleDocsCustomDataVersion2">
-  <go:docsCustomData xmlns:go="http://customooxmlschemas.google.com/" roundtripDataSignature="AMtx7mhSX/VwycATqnsJoTf/YnMwBvpmtQ==">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</go:docsCustomData>
+  <go:docsCustomData xmlns:go="http://customooxmlschemas.google.com/" roundtripDataSignature="AMtx7mg4lj1qlFnL9lAQhVC4z3Q4TVvyCA==">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</go:docsCustomData>
 </go:gDocsCustomXmlDataStorage>
 </file>
 

</xml_diff>